<commit_message>
Expand VfM knowledge base and reports
</commit_message>
<xml_diff>
--- a/_site/reports/defence-vfm-guidance.docx
+++ b/_site/reports/defence-vfm-guidance.docx
@@ -36,7 +36,7 @@
         </w:p>
       </w:sdtContent>
     </w:sdt>
-    <w:bookmarkStart w:id="22" w:name="purpose"/>
+    <w:bookmarkStart w:id="21" w:name="purpose"/>
     <w:p>
       <w:pPr>
         <w:pStyle w:val="Heading2"/>
@@ -50,7 +50,7 @@
         <w:pStyle w:val="FirstParagraph"/>
       </w:pPr>
       <w:r>
-        <w:t xml:space="preserve">This report converts a draft defence value for money (VfM) framework into practical guidance for evaluators. It is grounded in Oxford Policy Management’s rubric-based approach to VfM assessment</w:t>
+        <w:t xml:space="preserve">This report provides practical value for money (VfM) evaluation framework guidance for evaluators in the defence sector. It is not official policy. It is grounded in Oxford Policy Management’s rubric-based approach to VfM assessment</w:t>
       </w:r>
       <w:r>
         <w:t xml:space="preserve"> </w:t>
@@ -71,7 +71,7 @@
         <w:t xml:space="preserve">(King and Hurrell 2024)</w:t>
       </w:r>
       <w:r>
-        <w:t xml:space="preserve">, then adapts those ideas to defence capability, digital, and infrastructure programmes.</w:t>
+        <w:t xml:space="preserve">, then adapts those ideas to defence capability, digital and cyber, infrastructure, and personnel programmes.</w:t>
       </w:r>
     </w:p>
     <w:p>
@@ -79,60 +79,283 @@
         <w:pStyle w:val="BodyText"/>
       </w:pPr>
       <w:r>
-        <w:t xml:space="preserve">The central message is simple: defence VfM is not proved by a benefit-cost ratio alone. Evaluators need a transparent judgement about whether resource use is good enough in context, given the capability created, the risks carried, the alternatives available, and the value that is hard to monetise.</w:t>
-      </w:r>
-    </w:p>
-    <w:p>
-      <w:pPr>
-        <w:pStyle w:val="BodyText"/>
-      </w:pPr>
+        <w:t xml:space="preserve">This report explains how to apply a defence VfM evaluation. The</w:t>
+      </w:r>
+      <w:r>
+        <w:t xml:space="preserve"> </w:t>
+      </w:r>
       <w:hyperlink r:id="rId20">
         <w:r>
           <w:rPr>
             <w:rStyle w:val="Hyperlink"/>
           </w:rPr>
-          <w:t xml:space="preserve">Download PDF</w:t>
+          <w:t xml:space="preserve">Defence VfI Rubric Generation</w:t>
         </w:r>
       </w:hyperlink>
       <w:r>
         <w:t xml:space="preserve"> </w:t>
       </w:r>
-      <w:hyperlink r:id="rId21">
-        <w:r>
-          <w:rPr>
-            <w:rStyle w:val="Hyperlink"/>
-          </w:rPr>
-          <w:t xml:space="preserve">Download Word</w:t>
-        </w:r>
-      </w:hyperlink>
-    </w:p>
+      <w:r>
+        <w:t xml:space="preserve">report sits alongside it and explains how to build the criteria, subcriteria, standards, and evidence plan before applying the evaluation. Use that report when the framework itself needs to be generated or checked; use this report when the framework is being applied to an evaluation question.</w:t>
+      </w:r>
+    </w:p>
+    <w:bookmarkEnd w:id="21"/>
+    <w:bookmarkStart w:id="34" w:name="evaluation-workflow"/>
+    <w:p>
+      <w:pPr>
+        <w:pStyle w:val="Heading2"/>
+      </w:pPr>
+      <w:r>
+        <w:t xml:space="preserve">Evaluation Workflow</w:t>
+      </w:r>
+    </w:p>
+    <w:p>
+      <w:pPr>
+        <w:pStyle w:val="FirstParagraph"/>
+      </w:pPr>
+      <w:r>
+        <w:t xml:space="preserve">Verian’s Value for Investment process has two phases: design and implementation. The design phase covers understanding the programme, defining the value proposition and evaluation questions, setting criteria, setting standards, and determining the evidence needed. The implementation phase covers gathering evidence, analysing evidence, synthesising judgements through the criteria and standards, and reporting clear answers</w:t>
+      </w:r>
+      <w:r>
+        <w:t xml:space="preserve"> </w:t>
+      </w:r>
+      <w:r>
+        <w:t xml:space="preserve">(King and Hurrell 2024)</w:t>
+      </w:r>
+      <w:r>
+        <w:t xml:space="preserve">.</w:t>
+      </w:r>
+    </w:p>
+    <w:bookmarkStart w:id="22" w:name="using-source-guidance-within-the-five-es"/>
+    <w:p>
+      <w:pPr>
+        <w:pStyle w:val="Heading3"/>
+      </w:pPr>
+      <w:r>
+        <w:t xml:space="preserve">Using Source Guidance Within the Five Es</w:t>
+      </w:r>
+    </w:p>
+    <w:p>
+      <w:pPr>
+        <w:pStyle w:val="FirstParagraph"/>
+      </w:pPr>
+      <w:r>
+        <w:t xml:space="preserve">This report keeps the five Es as the organising criteria: economy, efficiency, effectiveness, equity, and cost-effectiveness. Other important themes, including risk, resilience, learning, capability, evidence quality, commercial assurance, and efficiency savings, should normally be handled as subcriteria, standards, or evidence tests within those five criteria rather than added as separate criteria.</w:t>
+      </w:r>
+    </w:p>
+    <w:p>
+      <w:pPr>
+        <w:pStyle w:val="BodyText"/>
+      </w:pPr>
+      <w:r>
+        <w:t xml:space="preserve">Use the sources in different ways:</w:t>
+      </w:r>
+    </w:p>
+    <w:tbl>
+      <w:tblPr>
+        <w:tblStyle w:val="Table"/>
+        <w:tblW w:type="pct" w:w="5000"/>
+        <w:tblLayout w:type="fixed"/>
+        <w:tblLook w:firstRow="1" w:lastRow="0" w:firstColumn="0" w:lastColumn="0" w:noHBand="0" w:noVBand="0" w:val="0020"/>
+      </w:tblPr>
+      <w:tblGrid>
+        <w:gridCol w:w="3960"/>
+        <w:gridCol w:w="3960"/>
+      </w:tblGrid>
+      <w:tr>
+        <w:trPr>
+          <w:tblHeader w:val="on"/>
+        </w:trPr>
+        <w:tc>
+          <w:tcPr/>
+          <w:p>
+            <w:pPr>
+              <w:pStyle w:val="Compact"/>
+            </w:pPr>
+            <w:r>
+              <w:t xml:space="preserve">Source</w:t>
+            </w:r>
+          </w:p>
+        </w:tc>
+        <w:tc>
+          <w:tcPr/>
+          <w:p>
+            <w:pPr>
+              <w:pStyle w:val="Compact"/>
+            </w:pPr>
+            <w:r>
+              <w:t xml:space="preserve">Role within the five Es</w:t>
+            </w:r>
+          </w:p>
+        </w:tc>
+      </w:tr>
+      <w:tr>
+        <w:tc>
+          <w:tcPr/>
+          <w:p>
+            <w:pPr>
+              <w:pStyle w:val="Compact"/>
+            </w:pPr>
+            <w:r>
+              <w:t xml:space="preserve">OPM and Verian</w:t>
+            </w:r>
+          </w:p>
+        </w:tc>
+        <w:tc>
+          <w:tcPr/>
+          <w:p>
+            <w:pPr>
+              <w:pStyle w:val="Compact"/>
+            </w:pPr>
+            <w:r>
+              <w:t xml:space="preserve">Provide the judgement architecture: value proposition, criteria, subcriteria, standards, evidence, synthesis, and transparent trade-offs</w:t>
+            </w:r>
+            <w:r>
+              <w:t xml:space="preserve"> </w:t>
+            </w:r>
+            <w:r>
+              <w:t xml:space="preserve">(King et al. 2023; King and Hurrell 2024)</w:t>
+            </w:r>
+            <w:r>
+              <w:t xml:space="preserve">.</w:t>
+            </w:r>
+          </w:p>
+        </w:tc>
+      </w:tr>
+      <w:tr>
+        <w:tc>
+          <w:tcPr/>
+          <w:p>
+            <w:pPr>
+              <w:pStyle w:val="Compact"/>
+            </w:pPr>
+            <w:r>
+              <w:t xml:space="preserve">Green Book</w:t>
+            </w:r>
+          </w:p>
+        </w:tc>
+        <w:tc>
+          <w:tcPr/>
+          <w:p>
+            <w:pPr>
+              <w:pStyle w:val="Compact"/>
+            </w:pPr>
+            <w:r>
+              <w:t xml:space="preserve">Anchors objectives, public value, options, monetised and unmonetised effects, distribution, risk, uncertainty, and decision advice</w:t>
+            </w:r>
+            <w:r>
+              <w:t xml:space="preserve"> </w:t>
+            </w:r>
+            <w:r>
+              <w:t xml:space="preserve">(HM Treasury 2026, 2022)</w:t>
+            </w:r>
+            <w:r>
+              <w:t xml:space="preserve">.</w:t>
+            </w:r>
+          </w:p>
+        </w:tc>
+      </w:tr>
+      <w:tr>
+        <w:tc>
+          <w:tcPr/>
+          <w:p>
+            <w:pPr>
+              <w:pStyle w:val="Compact"/>
+            </w:pPr>
+            <w:r>
+              <w:t xml:space="preserve">JSP 507</w:t>
+            </w:r>
+          </w:p>
+        </w:tc>
+        <w:tc>
+          <w:tcPr/>
+          <w:p>
+            <w:pPr>
+              <w:pStyle w:val="Compact"/>
+            </w:pPr>
+            <w:r>
+              <w:t xml:space="preserve">Supplies defence appraisal and evaluation evidence on requirements, whole-life cost, CEA, COEIA, affordability, risk, optimism bias, and outturn evaluation</w:t>
+            </w:r>
+            <w:r>
+              <w:t xml:space="preserve"> </w:t>
+            </w:r>
+            <w:r>
+              <w:t xml:space="preserve">(Ministry of Defence 2014a, 2014b)</w:t>
+            </w:r>
+            <w:r>
+              <w:t xml:space="preserve">.</w:t>
+            </w:r>
+          </w:p>
+        </w:tc>
+      </w:tr>
+      <w:tr>
+        <w:tc>
+          <w:tcPr/>
+          <w:p>
+            <w:pPr>
+              <w:pStyle w:val="Compact"/>
+            </w:pPr>
+            <w:r>
+              <w:t xml:space="preserve">Sourcing guidance</w:t>
+            </w:r>
+          </w:p>
+        </w:tc>
+        <w:tc>
+          <w:tcPr/>
+          <w:p>
+            <w:pPr>
+              <w:pStyle w:val="Compact"/>
+            </w:pPr>
+            <w:r>
+              <w:t xml:space="preserve">Strengthens economy, equity, and cost-effectiveness through delivery model assessment, market health, should-cost evidence, bid evaluation, supplier resilience, risk allocation, pricing, KPIs, and benefits evidence</w:t>
+            </w:r>
+            <w:r>
+              <w:t xml:space="preserve"> </w:t>
+            </w:r>
+            <w:r>
+              <w:t xml:space="preserve">(Cabinet Office and Government Commercial Function 2026)</w:t>
+            </w:r>
+            <w:r>
+              <w:t xml:space="preserve">.</w:t>
+            </w:r>
+          </w:p>
+        </w:tc>
+      </w:tr>
+      <w:tr>
+        <w:tc>
+          <w:tcPr/>
+          <w:p>
+            <w:pPr>
+              <w:pStyle w:val="Compact"/>
+            </w:pPr>
+            <w:r>
+              <w:t xml:space="preserve">Government Efficiency Framework</w:t>
+            </w:r>
+          </w:p>
+        </w:tc>
+        <w:tc>
+          <w:tcPr/>
+          <w:p>
+            <w:pPr>
+              <w:pStyle w:val="Compact"/>
+            </w:pPr>
+            <w:r>
+              <w:t xml:space="preserve">Strengthens efficiency evidence by testing baselines, counterfactuals, net savings, recurrence, double counting, assurance, and protection of outputs and outcomes</w:t>
+            </w:r>
+            <w:r>
+              <w:t xml:space="preserve"> </w:t>
+            </w:r>
+            <w:r>
+              <w:t xml:space="preserve">(HM Treasury 2025a, 2025b)</w:t>
+            </w:r>
+            <w:r>
+              <w:t xml:space="preserve">.</w:t>
+            </w:r>
+          </w:p>
+        </w:tc>
+      </w:tr>
+    </w:tbl>
     <w:bookmarkEnd w:id="22"/>
-    <w:bookmarkStart w:id="31" w:name="evaluation-workflow"/>
-    <w:p>
-      <w:pPr>
-        <w:pStyle w:val="Heading2"/>
-      </w:pPr>
-      <w:r>
-        <w:t xml:space="preserve">Evaluation Workflow</w:t>
-      </w:r>
-    </w:p>
-    <w:p>
-      <w:pPr>
-        <w:pStyle w:val="FirstParagraph"/>
-      </w:pPr>
-      <w:r>
-        <w:t xml:space="preserve">Verian’s Value for Investment process has two phases: design and implementation. The design phase covers understanding the programme, defining the value proposition and evaluation questions, setting criteria, setting standards, and determining the evidence needed. The implementation phase covers gathering evidence, analysing evidence, synthesising judgements through the criteria and standards, and reporting clear answers</w:t>
-      </w:r>
-      <w:r>
-        <w:t xml:space="preserve"> </w:t>
-      </w:r>
-      <w:r>
-        <w:t xml:space="preserve">(King and Hurrell 2024)</w:t>
-      </w:r>
-      <w:r>
-        <w:t xml:space="preserve">.</w:t>
-      </w:r>
-    </w:p>
     <w:bookmarkStart w:id="23" w:name="understand-the-programme"/>
     <w:p>
       <w:pPr>
@@ -362,7 +585,7 @@
         <w:pStyle w:val="FirstParagraph"/>
       </w:pPr>
       <w:r>
-        <w:t xml:space="preserve">Use the 5Es as a starting structure, then translate each criterion into defence language. Do not assume each E has equal weight in every programme.</w:t>
+        <w:t xml:space="preserve">Use the 5Es as the criteria structure, then translate each criterion into defence language. Do not assume each E has equal weight in every programme. Do not create extra top-level criteria unless a separate governance process requires it. In this report, risk, resilience, learning, capability, evidence quality, sourcing, and assurance are treated as subcriteria, standards, or evidence checks within the five Es.</w:t>
       </w:r>
     </w:p>
     <w:tbl>
@@ -596,6 +819,412 @@
         <w:pStyle w:val="BodyText"/>
       </w:pPr>
       <w:r>
+        <w:t xml:space="preserve">After selecting criteria, define a small number of subcriteria for each one before selecting indicators or evidence. In the OPM approach, the sequence matters: understand the value proposition, select relevant criteria, write programme-specific definitions, identify subcriteria, define standards, and only then decide what evidence is needed</w:t>
+      </w:r>
+      <w:r>
+        <w:t xml:space="preserve"> </w:t>
+      </w:r>
+      <w:r>
+        <w:t xml:space="preserve">(King et al. 2023)</w:t>
+      </w:r>
+      <w:r>
+        <w:t xml:space="preserve">. Verian’s Value for Investment guidance follows the same logic by using criteria and standards to make wider public value, trade-offs, and non-monetised effects explicit</w:t>
+      </w:r>
+      <w:r>
+        <w:t xml:space="preserve"> </w:t>
+      </w:r>
+      <w:r>
+        <w:t xml:space="preserve">(King and Hurrell 2024)</w:t>
+      </w:r>
+      <w:r>
+        <w:t xml:space="preserve">.</w:t>
+      </w:r>
+    </w:p>
+    <w:p>
+      <w:pPr>
+        <w:pStyle w:val="BodyText"/>
+      </w:pPr>
+      <w:r>
+        <w:t xml:space="preserve">Subcriteria should describe the dimensions of performance that would make resource use good in the programme context. They are not a generic checklist and they are not simply data headings. They should be derived from the value proposition, theory of change, decision context, stakeholder perspectives, and the main trade-offs the evaluation needs to judge.</w:t>
+      </w:r>
+    </w:p>
+    <w:p>
+      <w:pPr>
+        <w:pStyle w:val="BodyText"/>
+      </w:pPr>
+      <w:r>
+        <w:t xml:space="preserve">Good subcriteria usually do four things:</w:t>
+      </w:r>
+    </w:p>
+    <w:p>
+      <w:pPr>
+        <w:pStyle w:val="Compact"/>
+        <w:numPr>
+          <w:ilvl w:val="0"/>
+          <w:numId w:val="1003"/>
+        </w:numPr>
+      </w:pPr>
+      <w:r>
+        <w:t xml:space="preserve">make each criterion specific enough to judge, for example by distinguishing input stewardship, output quality, access, risks, contribution, trade-offs, or non-monetised value;</w:t>
+      </w:r>
+    </w:p>
+    <w:p>
+      <w:pPr>
+        <w:pStyle w:val="Compact"/>
+        <w:numPr>
+          <w:ilvl w:val="0"/>
+          <w:numId w:val="1003"/>
+        </w:numPr>
+      </w:pPr>
+      <w:r>
+        <w:t xml:space="preserve">cover the most material parts of the resource-to-value pathway without trying to measure everything;</w:t>
+      </w:r>
+    </w:p>
+    <w:p>
+      <w:pPr>
+        <w:pStyle w:val="Compact"/>
+        <w:numPr>
+          <w:ilvl w:val="0"/>
+          <w:numId w:val="1003"/>
+        </w:numPr>
+      </w:pPr>
+      <w:r>
+        <w:t xml:space="preserve">separate different kinds of performance that might otherwise be hidden inside one rating, such as delivery speed, output quality, targeting, learning, and coordination;</w:t>
+      </w:r>
+    </w:p>
+    <w:p>
+      <w:pPr>
+        <w:pStyle w:val="Compact"/>
+        <w:numPr>
+          <w:ilvl w:val="0"/>
+          <w:numId w:val="1003"/>
+        </w:numPr>
+      </w:pPr>
+      <w:r>
+        <w:t xml:space="preserve">support standards and evidence planning, so evaluators can later say what would count as poor, adequate, good, or excellent performance.</w:t>
+      </w:r>
+    </w:p>
+    <w:p>
+      <w:pPr>
+        <w:pStyle w:val="FirstParagraph"/>
+      </w:pPr>
+      <w:r>
+        <w:t xml:space="preserve">Subcriteria should generally follow the main question each E is asking rather than repeat programme-specific evidence lists. Efficiency needs particular care: a narrow cost-per-output view may be useful for some activities, but it can miss important features of complex capability, digital, infrastructure, and personnel programmes. Following OPM’s approach, efficiency subcriteria should distinguish technical, allocative, dynamic, and relational efficiency where those distinctions matter.</w:t>
+      </w:r>
+    </w:p>
+    <w:tbl>
+      <w:tblPr>
+        <w:tblStyle w:val="Table"/>
+        <w:tblW w:type="pct" w:w="5000"/>
+        <w:tblLayout w:type="fixed"/>
+        <w:tblLook w:firstRow="1" w:lastRow="0" w:firstColumn="0" w:lastColumn="0" w:noHBand="0" w:noVBand="0" w:val="0020"/>
+      </w:tblPr>
+      <w:tblGrid>
+        <w:gridCol w:w="2640"/>
+        <w:gridCol w:w="2640"/>
+        <w:gridCol w:w="2640"/>
+      </w:tblGrid>
+      <w:tr>
+        <w:trPr>
+          <w:tblHeader w:val="on"/>
+        </w:trPr>
+        <w:tc>
+          <w:tcPr/>
+          <w:p>
+            <w:pPr>
+              <w:pStyle w:val="Compact"/>
+            </w:pPr>
+            <w:r>
+              <w:t xml:space="preserve">Criterion</w:t>
+            </w:r>
+          </w:p>
+        </w:tc>
+        <w:tc>
+          <w:tcPr/>
+          <w:p>
+            <w:pPr>
+              <w:pStyle w:val="Compact"/>
+            </w:pPr>
+            <w:r>
+              <w:t xml:space="preserve">Subcriteria should clarify</w:t>
+            </w:r>
+          </w:p>
+        </w:tc>
+        <w:tc>
+          <w:tcPr/>
+          <w:p>
+            <w:pPr>
+              <w:pStyle w:val="Compact"/>
+            </w:pPr>
+            <w:r>
+              <w:t xml:space="preserve">Generic subcriteria focus</w:t>
+            </w:r>
+          </w:p>
+        </w:tc>
+      </w:tr>
+      <w:tr>
+        <w:tc>
+          <w:tcPr/>
+          <w:p>
+            <w:pPr>
+              <w:pStyle w:val="Compact"/>
+            </w:pPr>
+            <w:r>
+              <w:t xml:space="preserve">Economy</w:t>
+            </w:r>
+          </w:p>
+        </w:tc>
+        <w:tc>
+          <w:tcPr/>
+          <w:p>
+            <w:pPr>
+              <w:pStyle w:val="Compact"/>
+            </w:pPr>
+            <w:r>
+              <w:t xml:space="preserve">Which inputs need stewardship, what quality threshold is required, and which cost or probity risks would undermine value.</w:t>
+            </w:r>
+          </w:p>
+        </w:tc>
+        <w:tc>
+          <w:tcPr/>
+          <w:p>
+            <w:pPr>
+              <w:pStyle w:val="Compact"/>
+            </w:pPr>
+            <w:r>
+              <w:t xml:space="preserve">Price reasonableness, input quality, procurement discipline, probity, cost drivers, stewardship, and risks of false economy.</w:t>
+            </w:r>
+          </w:p>
+        </w:tc>
+      </w:tr>
+      <w:tr>
+        <w:tc>
+          <w:tcPr/>
+          <w:p>
+            <w:pPr>
+              <w:pStyle w:val="Compact"/>
+            </w:pPr>
+            <w:r>
+              <w:t xml:space="preserve">Efficiency</w:t>
+            </w:r>
+          </w:p>
+        </w:tc>
+        <w:tc>
+          <w:tcPr/>
+          <w:p>
+            <w:pPr>
+              <w:pStyle w:val="Compact"/>
+            </w:pPr>
+            <w:r>
+              <w:t xml:space="preserve">How resources are converted into outputs, whether the right activities are prioritised, whether learning improves resource use, and whether relationships reduce waste.</w:t>
+            </w:r>
+          </w:p>
+        </w:tc>
+        <w:tc>
+          <w:tcPr/>
+          <w:p>
+            <w:pPr>
+              <w:pStyle w:val="Compact"/>
+            </w:pPr>
+            <w:r>
+              <w:rPr>
+                <w:b/>
+                <w:bCs/>
+              </w:rPr>
+              <w:t xml:space="preserve">Technical efficiency:</w:t>
+            </w:r>
+            <w:r>
+              <w:t xml:space="preserve"> </w:t>
+            </w:r>
+            <w:r>
+              <w:t xml:space="preserve">unit or activity cost, timeliness, output quality, budget adherence, process productivity, and avoidable rework.</w:t>
+            </w:r>
+            <w:r>
+              <w:t xml:space="preserve"> </w:t>
+            </w:r>
+            <w:r>
+              <w:rPr>
+                <w:b/>
+                <w:bCs/>
+              </w:rPr>
+              <w:t xml:space="preserve">Allocative efficiency:</w:t>
+            </w:r>
+            <w:r>
+              <w:t xml:space="preserve"> </w:t>
+            </w:r>
+            <w:r>
+              <w:t xml:space="preserve">portfolio balance, targeting, prioritisation, option choices, stopping lower-value activity, and shifting resources to higher-value opportunities.</w:t>
+            </w:r>
+            <w:r>
+              <w:t xml:space="preserve"> </w:t>
+            </w:r>
+            <w:r>
+              <w:rPr>
+                <w:b/>
+                <w:bCs/>
+              </w:rPr>
+              <w:t xml:space="preserve">Dynamic efficiency:</w:t>
+            </w:r>
+            <w:r>
+              <w:t xml:space="preserve"> </w:t>
+            </w:r>
+            <w:r>
+              <w:t xml:space="preserve">feedback loops, experimentation, learning from failure, incremental improvement, timely adaptation, and productivity over time.</w:t>
+            </w:r>
+            <w:r>
+              <w:t xml:space="preserve"> </w:t>
+            </w:r>
+            <w:r>
+              <w:rPr>
+                <w:b/>
+                <w:bCs/>
+              </w:rPr>
+              <w:t xml:space="preserve">Relational efficiency:</w:t>
+            </w:r>
+            <w:r>
+              <w:t xml:space="preserve"> </w:t>
+            </w:r>
+            <w:r>
+              <w:t xml:space="preserve">trust, coordination, partner alignment, information sharing, dispute resolution, reduced duplication, and lower transaction costs.</w:t>
+            </w:r>
+          </w:p>
+        </w:tc>
+      </w:tr>
+      <w:tr>
+        <w:tc>
+          <w:tcPr/>
+          <w:p>
+            <w:pPr>
+              <w:pStyle w:val="Compact"/>
+            </w:pPr>
+            <w:r>
+              <w:t xml:space="preserve">Effectiveness</w:t>
+            </w:r>
+          </w:p>
+        </w:tc>
+        <w:tc>
+          <w:tcPr/>
+          <w:p>
+            <w:pPr>
+              <w:pStyle w:val="Compact"/>
+            </w:pPr>
+            <w:r>
+              <w:t xml:space="preserve">Which outputs must work, for whom, under what conditions, and how they plausibly contribute to intended outcomes.</w:t>
+            </w:r>
+          </w:p>
+        </w:tc>
+        <w:tc>
+          <w:tcPr/>
+          <w:p>
+            <w:pPr>
+              <w:pStyle w:val="Compact"/>
+            </w:pPr>
+            <w:r>
+              <w:t xml:space="preserve">Output quality, outcome contribution, causal assumptions, user or beneficiary uptake, unintended effects, and contextual conditions.</w:t>
+            </w:r>
+          </w:p>
+        </w:tc>
+      </w:tr>
+      <w:tr>
+        <w:tc>
+          <w:tcPr/>
+          <w:p>
+            <w:pPr>
+              <w:pStyle w:val="Compact"/>
+            </w:pPr>
+            <w:r>
+              <w:t xml:space="preserve">Equity</w:t>
+            </w:r>
+          </w:p>
+        </w:tc>
+        <w:tc>
+          <w:tcPr/>
+          <w:p>
+            <w:pPr>
+              <w:pStyle w:val="Compact"/>
+            </w:pPr>
+            <w:r>
+              <w:t xml:space="preserve">How benefits, burdens, access, risks, and future liabilities are distributed across stakeholders and over time.</w:t>
+            </w:r>
+          </w:p>
+        </w:tc>
+        <w:tc>
+          <w:tcPr/>
+          <w:p>
+            <w:pPr>
+              <w:pStyle w:val="Compact"/>
+            </w:pPr>
+            <w:r>
+              <w:t xml:space="preserve">Inclusion, access, differential outcomes, distribution of costs and risks, burden sharing, dignity, and intergenerational effects.</w:t>
+            </w:r>
+          </w:p>
+        </w:tc>
+      </w:tr>
+      <w:tr>
+        <w:tc>
+          <w:tcPr/>
+          <w:p>
+            <w:pPr>
+              <w:pStyle w:val="Compact"/>
+            </w:pPr>
+            <w:r>
+              <w:t xml:space="preserve">Cost-effectiveness</w:t>
+            </w:r>
+          </w:p>
+        </w:tc>
+        <w:tc>
+          <w:tcPr/>
+          <w:p>
+            <w:pPr>
+              <w:pStyle w:val="Compact"/>
+            </w:pPr>
+            <w:r>
+              <w:t xml:space="preserve">Which outcomes or impacts justify the resources used, what alternatives are credible, and how monetised and non-monetised value will be weighed.</w:t>
+            </w:r>
+          </w:p>
+        </w:tc>
+        <w:tc>
+          <w:tcPr/>
+          <w:p>
+            <w:pPr>
+              <w:pStyle w:val="Compact"/>
+            </w:pPr>
+            <w:r>
+              <w:t xml:space="preserve">Costs relative to outcomes, alternatives, opportunity cost, uncertainty, sustainability, equity goals, and qualitative value judgement.</w:t>
+            </w:r>
+          </w:p>
+        </w:tc>
+      </w:tr>
+    </w:tbl>
+    <w:p>
+      <w:pPr>
+        <w:pStyle w:val="BodyText"/>
+      </w:pPr>
+      <w:r>
+        <w:t xml:space="preserve">These efficiency types should be used selectively. For example, technical efficiency may dominate a mature equipment delivery question, while dynamic and relational efficiency may be more important for cyber, digital, innovation, partnering, or complex transformation programmes.</w:t>
+      </w:r>
+    </w:p>
+    <w:p>
+      <w:pPr>
+        <w:pStyle w:val="BodyText"/>
+      </w:pPr>
+      <w:r>
+        <w:t xml:space="preserve">If an efficiency or savings claim is material, test it against Government Efficiency Framework-style evidence. A credible efficiency claim should distinguish forecast from realised savings, state the baseline and counterfactual, net off costs to deliver, show whether savings are recurring, prevent double counting, and demonstrate that outputs, outcomes, quality, safety, security, or strategic priorities have not deteriorated. Underspend, cancellation, delayed spending, inflation changes, reduced output, unfunded transfer of work, cost shifting to another organisation, or unsupported forecast savings should not be treated as efficiency evidence without a separate value argument.</w:t>
+      </w:r>
+    </w:p>
+    <w:p>
+      <w:pPr>
+        <w:pStyle w:val="BodyText"/>
+      </w:pPr>
+      <w:r>
+        <w:t xml:space="preserve">The detailed defence subcriteria and evidence prompts later in this report show how these general design prompts can be translated into programme-specific assessment headings.</w:t>
+      </w:r>
+    </w:p>
+    <w:p>
+      <w:pPr>
+        <w:pStyle w:val="BodyText"/>
+      </w:pPr>
+      <w:r>
         <w:t xml:space="preserve">The 5Es are often most useful for ex-post or in-flight assessment. For ex-ante decisions, coordinate with the Green Book five-case model and use explicit criteria to make the strategic, economic, commercial, financial, and management cases easier to judge coherently.</w:t>
       </w:r>
     </w:p>
@@ -793,8 +1422,28 @@
         <w:t xml:space="preserve">for accommodation modernisation. The former may turn on assured communications, contested-environment resilience, and allied interoperability; the latter may turn on living conditions, occupancy, maintainability, and effects on personnel welfare.</w:t>
       </w:r>
     </w:p>
+    <w:p>
+      <w:pPr>
+        <w:pStyle w:val="BodyText"/>
+      </w:pPr>
+      <w:r>
+        <w:t xml:space="preserve">For each E, standards should also state what evidence confidence is required. A</w:t>
+      </w:r>
+      <w:r>
+        <w:t xml:space="preserve"> </w:t>
+      </w:r>
+      <w:r>
+        <w:t xml:space="preserve">“good”</w:t>
+      </w:r>
+      <w:r>
+        <w:t xml:space="preserve"> </w:t>
+      </w:r>
+      <w:r>
+        <w:t xml:space="preserve">rating should not rest on weak source traceability, untested assumptions, unsupported efficiency claims, or evidence that covers only monetised effects while omitting material operational, social, environmental, distributional, or future value. Where evidence is partial, commercially sensitive, classified, or immature, the rating should explain how that limitation affects confidence.</w:t>
+      </w:r>
+    </w:p>
     <w:bookmarkEnd w:id="26"/>
-    <w:bookmarkStart w:id="27" w:name="identify-the-evidence-and-methods-needed"/>
+    <w:bookmarkStart w:id="28" w:name="identify-the-evidence-and-methods-needed"/>
     <w:p>
       <w:pPr>
         <w:pStyle w:val="Heading3"/>
@@ -826,168 +1475,6 @@
       </w:pPr>
       <w:r>
         <w:t xml:space="preserve">Common evidence sources include:</w:t>
-      </w:r>
-    </w:p>
-    <w:p>
-      <w:pPr>
-        <w:pStyle w:val="Compact"/>
-        <w:numPr>
-          <w:ilvl w:val="0"/>
-          <w:numId w:val="1003"/>
-        </w:numPr>
-      </w:pPr>
-      <w:r>
-        <w:t xml:space="preserve">business cases, approvals, commercial strategies, contract data, cost models, and cost assurance;</w:t>
-      </w:r>
-    </w:p>
-    <w:p>
-      <w:pPr>
-        <w:pStyle w:val="Compact"/>
-        <w:numPr>
-          <w:ilvl w:val="0"/>
-          <w:numId w:val="1003"/>
-        </w:numPr>
-      </w:pPr>
-      <w:r>
-        <w:t xml:space="preserve">schedules, risk registers, issue logs, test results, acceptance evidence, and support data;</w:t>
-      </w:r>
-    </w:p>
-    <w:p>
-      <w:pPr>
-        <w:pStyle w:val="Compact"/>
-        <w:numPr>
-          <w:ilvl w:val="0"/>
-          <w:numId w:val="1003"/>
-        </w:numPr>
-      </w:pPr>
-      <w:r>
-        <w:t xml:space="preserve">operational analysis, trials, exercises, user research, training records, and readiness data;</w:t>
-      </w:r>
-    </w:p>
-    <w:p>
-      <w:pPr>
-        <w:pStyle w:val="Compact"/>
-        <w:numPr>
-          <w:ilvl w:val="0"/>
-          <w:numId w:val="1003"/>
-        </w:numPr>
-      </w:pPr>
-      <w:r>
-        <w:t xml:space="preserve">cyber, safety, security, resilience, interoperability, and data-governance evidence;</w:t>
-      </w:r>
-    </w:p>
-    <w:p>
-      <w:pPr>
-        <w:pStyle w:val="Compact"/>
-        <w:numPr>
-          <w:ilvl w:val="0"/>
-          <w:numId w:val="1003"/>
-        </w:numPr>
-      </w:pPr>
-      <w:r>
-        <w:t xml:space="preserve">supplier, workforce, estate, environmental, community, and industrial-base evidence;</w:t>
-      </w:r>
-    </w:p>
-    <w:p>
-      <w:pPr>
-        <w:pStyle w:val="Compact"/>
-        <w:numPr>
-          <w:ilvl w:val="0"/>
-          <w:numId w:val="1003"/>
-        </w:numPr>
-      </w:pPr>
-      <w:r>
-        <w:t xml:space="preserve">comparator evidence from allies, commercial alternatives, previous programmes, or portfolio options;</w:t>
-      </w:r>
-    </w:p>
-    <w:p>
-      <w:pPr>
-        <w:pStyle w:val="Compact"/>
-        <w:numPr>
-          <w:ilvl w:val="0"/>
-          <w:numId w:val="1003"/>
-        </w:numPr>
-      </w:pPr>
-      <w:r>
-        <w:t xml:space="preserve">stakeholder evidence from users, front-line commands, maintainers, digital operators, commercial staff, suppliers, local communities, and allied partners.</w:t>
-      </w:r>
-    </w:p>
-    <w:p>
-      <w:pPr>
-        <w:pStyle w:val="FirstParagraph"/>
-      </w:pPr>
-      <w:r>
-        <w:t xml:space="preserve">At this point, decide whether cost-benefit analysis, cost-effectiveness analysis, break-even analysis, scenario analysis, or another economic method can make a useful contribution. Include CBA where the cost-benefit test is relevant, outcomes and costs can be credibly quantified and monetised, and the necessary data, skills, time, and ethical conditions are present. Where those conditions do not hold, use CBA only for the monetisable part of the value story or use a rubric-based VfM assessment as the main method.</w:t>
-      </w:r>
-    </w:p>
-    <w:bookmarkEnd w:id="27"/>
-    <w:bookmarkStart w:id="28" w:name="gather-evidence"/>
-    <w:p>
-      <w:pPr>
-        <w:pStyle w:val="Heading3"/>
-      </w:pPr>
-      <w:r>
-        <w:t xml:space="preserve">6. Gather Evidence</w:t>
-      </w:r>
-    </w:p>
-    <w:p>
-      <w:pPr>
-        <w:pStyle w:val="FirstParagraph"/>
-      </w:pPr>
-      <w:r>
-        <w:t xml:space="preserve">Collect the agreed evidence in a way that follows the rubric. Survey, interview, document-review, trial-analysis, and administrative-data tools should use headings aligned to the criteria and subcriteria so evidence can be organised efficiently.</w:t>
-      </w:r>
-    </w:p>
-    <w:p>
-      <w:pPr>
-        <w:pStyle w:val="BodyText"/>
-      </w:pPr>
-      <w:r>
-        <w:t xml:space="preserve">Defence evaluations should plan for practical constraints: classified evidence, operational security, small user populations, immature outcome data, long benefit horizons, supplier confidentiality, and contested causal claims. These constraints should be recorded as evidence limitations, not hidden in the final judgement.</w:t>
-      </w:r>
-    </w:p>
-    <w:bookmarkEnd w:id="28"/>
-    <w:bookmarkStart w:id="29" w:name="analyse-evidence"/>
-    <w:p>
-      <w:pPr>
-        <w:pStyle w:val="Heading3"/>
-      </w:pPr>
-      <w:r>
-        <w:t xml:space="preserve">7. Analyse Evidence</w:t>
-      </w:r>
-    </w:p>
-    <w:p>
-      <w:pPr>
-        <w:pStyle w:val="FirstParagraph"/>
-      </w:pPr>
-      <w:r>
-        <w:t xml:space="preserve">Analyse each evidence stream separately before synthesis. Cost data, schedule data, test evidence, operational analysis, user feedback, cyber assurance, estate data, and supplier evidence each need their own quality checks.</w:t>
-      </w:r>
-    </w:p>
-    <w:p>
-      <w:pPr>
-        <w:pStyle w:val="BodyText"/>
-      </w:pPr>
-      <w:r>
-        <w:t xml:space="preserve">This is also where causal inference or contribution analysis should be handled. For some defence questions, a counterfactual may be available through options analysis, historical comparison, allied benchmarking, or status quo modelling. For others, a theory-based contribution claim will be more credible than forced monetisation.</w:t>
-      </w:r>
-    </w:p>
-    <w:bookmarkEnd w:id="29"/>
-    <w:bookmarkStart w:id="30" w:name="synthesize-judgements-and-report"/>
-    <w:p>
-      <w:pPr>
-        <w:pStyle w:val="Heading3"/>
-      </w:pPr>
-      <w:r>
-        <w:t xml:space="preserve">8. Synthesize Judgements and Report</w:t>
-      </w:r>
-    </w:p>
-    <w:p>
-      <w:pPr>
-        <w:pStyle w:val="FirstParagraph"/>
-      </w:pPr>
-      <w:r>
-        <w:t xml:space="preserve">The final VfM judgement should show the reasoning chain:</w:t>
       </w:r>
     </w:p>
     <w:p>
@@ -999,7 +1486,7 @@
         </w:numPr>
       </w:pPr>
       <w:r>
-        <w:t xml:space="preserve">programme context and theory of change;</w:t>
+        <w:t xml:space="preserve">business cases, approvals, commercial strategies, contract data, cost models, and cost assurance;</w:t>
       </w:r>
     </w:p>
     <w:p>
@@ -1011,7 +1498,7 @@
         </w:numPr>
       </w:pPr>
       <w:r>
-        <w:t xml:space="preserve">value proposition and evaluation questions;</w:t>
+        <w:t xml:space="preserve">schedules, risk registers, issue logs, test results, acceptance evidence, and support data;</w:t>
       </w:r>
     </w:p>
     <w:p>
@@ -1023,7 +1510,7 @@
         </w:numPr>
       </w:pPr>
       <w:r>
-        <w:t xml:space="preserve">tailored criteria and subcriteria;</w:t>
+        <w:t xml:space="preserve">operational analysis, trials, exercises, user research, training records, and readiness data;</w:t>
       </w:r>
     </w:p>
     <w:p>
@@ -1035,7 +1522,7 @@
         </w:numPr>
       </w:pPr>
       <w:r>
-        <w:t xml:space="preserve">agreed standards;</w:t>
+        <w:t xml:space="preserve">cyber, safety, security, resilience, interoperability, and data-governance evidence;</w:t>
       </w:r>
     </w:p>
     <w:p>
@@ -1047,7 +1534,7 @@
         </w:numPr>
       </w:pPr>
       <w:r>
-        <w:t xml:space="preserve">evidence by criterion;</w:t>
+        <w:t xml:space="preserve">supplier, workforce, estate, environmental, community, and industrial-base evidence;</w:t>
       </w:r>
     </w:p>
     <w:p>
@@ -1059,7 +1546,7 @@
         </w:numPr>
       </w:pPr>
       <w:r>
-        <w:t xml:space="preserve">analysis, ratings, and uncertainty;</w:t>
+        <w:t xml:space="preserve">delivery model assessments, market health evidence, should-cost models, bid evaluation records, KPI baselines, payment mechanisms, risk allocation matrices, supplier financial standing checks, continuity plans, and benefits reports;</w:t>
       </w:r>
     </w:p>
     <w:p>
@@ -1071,7 +1558,7 @@
         </w:numPr>
       </w:pPr>
       <w:r>
-        <w:t xml:space="preserve">trade-offs between criteria;</w:t>
+        <w:t xml:space="preserve">GEF-style efficiency evidence, including baselines, counterfactuals, gross and net savings, costs to deliver, recurrence, double-counting controls, outcome protection, and assurance records;</w:t>
       </w:r>
     </w:p>
     <w:p>
@@ -1083,7 +1570,7 @@
         </w:numPr>
       </w:pPr>
       <w:r>
-        <w:t xml:space="preserve">overall judgement;</w:t>
+        <w:t xml:space="preserve">comparator evidence from allies, commercial alternatives, previous programmes, or portfolio options;</w:t>
       </w:r>
     </w:p>
     <w:p>
@@ -1095,6 +1582,779 @@
         </w:numPr>
       </w:pPr>
       <w:r>
+        <w:t xml:space="preserve">stakeholder evidence from users, front-line commands, maintainers, digital operators, commercial staff, suppliers, local communities, and allied partners.</w:t>
+      </w:r>
+    </w:p>
+    <w:p>
+      <w:pPr>
+        <w:pStyle w:val="FirstParagraph"/>
+      </w:pPr>
+      <w:r>
+        <w:t xml:space="preserve">At this point, decide which economic evidence is proportionate. JSP 507 is clear that full cost-benefit analysis has a limited role in MOD because few defence activities produce benefits that can sensibly be valued in monetary terms; most MOD appraisals therefore use cost-effectiveness analysis, and many equipment decisions use Combined Operational Effectiveness and Investment Appraisal to compare through-life cost with operational or business effectiveness</w:t>
+      </w:r>
+      <w:r>
+        <w:t xml:space="preserve"> </w:t>
+      </w:r>
+      <w:r>
+        <w:t xml:space="preserve">(Ministry of Defence 2014a, 2014b)</w:t>
+      </w:r>
+      <w:r>
+        <w:t xml:space="preserve">. Treat CBA as exceptional rather than the default. Use it only where the material benefits can credibly be monetised, such as some health, safety, environmental, business-change, or spend-to-save cases, and seek Defence Economics advice where JSP 507 requires it. For most defence VfM evaluations, prioritise whole-life cost, cost-effectiveness or COEIA-style option comparison, break-even analysis, scenario and sensitivity analysis, and rubric-based judgement of non-monetised operational, strategic, resilience, safety, welfare, and future value. Where any monetised analysis is used, state clearly what it covers, what it omits, and how the omitted value affects the overall VfM judgement. The</w:t>
+      </w:r>
+      <w:r>
+        <w:t xml:space="preserve"> </w:t>
+      </w:r>
+      <w:hyperlink r:id="rId27">
+        <w:r>
+          <w:rPr>
+            <w:rStyle w:val="Hyperlink"/>
+          </w:rPr>
+          <w:t xml:space="preserve">JSP 507 Investment Appraisal and Evaluation</w:t>
+        </w:r>
+      </w:hyperlink>
+      <w:r>
+        <w:t xml:space="preserve"> </w:t>
+      </w:r>
+      <w:r>
+        <w:t xml:space="preserve">source note maps the guidance to VfI-style criteria, standards, and evidence prompts.</w:t>
+      </w:r>
+    </w:p>
+    <w:bookmarkEnd w:id="28"/>
+    <w:bookmarkStart w:id="29" w:name="evidence-quality-and-assurance"/>
+    <w:p>
+      <w:pPr>
+        <w:pStyle w:val="Heading3"/>
+      </w:pPr>
+      <w:r>
+        <w:t xml:space="preserve">Evidence Quality and Assurance</w:t>
+      </w:r>
+    </w:p>
+    <w:p>
+      <w:pPr>
+        <w:pStyle w:val="FirstParagraph"/>
+      </w:pPr>
+      <w:r>
+        <w:t xml:space="preserve">Evidence quality is not a separate top-level criterion in this report. It is a discipline that applies across all five Es. For each major evidence item, record what it informs, how it has been checked, what it cannot show, and how much weight it should carry in synthesis.</w:t>
+      </w:r>
+    </w:p>
+    <w:tbl>
+      <w:tblPr>
+        <w:tblStyle w:val="Table"/>
+        <w:tblW w:type="pct" w:w="5000"/>
+        <w:tblLayout w:type="fixed"/>
+        <w:tblLook w:firstRow="1" w:lastRow="0" w:firstColumn="0" w:lastColumn="0" w:noHBand="0" w:noVBand="0" w:val="0020"/>
+      </w:tblPr>
+      <w:tblGrid>
+        <w:gridCol w:w="1584"/>
+        <w:gridCol w:w="1584"/>
+        <w:gridCol w:w="1584"/>
+        <w:gridCol w:w="1584"/>
+        <w:gridCol w:w="1584"/>
+      </w:tblGrid>
+      <w:tr>
+        <w:trPr>
+          <w:tblHeader w:val="on"/>
+        </w:trPr>
+        <w:tc>
+          <w:tcPr/>
+          <w:p>
+            <w:pPr>
+              <w:pStyle w:val="Compact"/>
+            </w:pPr>
+            <w:r>
+              <w:t xml:space="preserve">Evidence item</w:t>
+            </w:r>
+          </w:p>
+        </w:tc>
+        <w:tc>
+          <w:tcPr/>
+          <w:p>
+            <w:pPr>
+              <w:pStyle w:val="Compact"/>
+            </w:pPr>
+            <w:r>
+              <w:t xml:space="preserve">Five-E use</w:t>
+            </w:r>
+          </w:p>
+        </w:tc>
+        <w:tc>
+          <w:tcPr/>
+          <w:p>
+            <w:pPr>
+              <w:pStyle w:val="Compact"/>
+            </w:pPr>
+            <w:r>
+              <w:t xml:space="preserve">Quality checks</w:t>
+            </w:r>
+          </w:p>
+        </w:tc>
+        <w:tc>
+          <w:tcPr/>
+          <w:p>
+            <w:pPr>
+              <w:pStyle w:val="Compact"/>
+            </w:pPr>
+            <w:r>
+              <w:t xml:space="preserve">Common limitation</w:t>
+            </w:r>
+          </w:p>
+        </w:tc>
+        <w:tc>
+          <w:tcPr/>
+          <w:p>
+            <w:pPr>
+              <w:pStyle w:val="Compact"/>
+            </w:pPr>
+            <w:r>
+              <w:t xml:space="preserve">Use in synthesis</w:t>
+            </w:r>
+          </w:p>
+        </w:tc>
+      </w:tr>
+      <w:tr>
+        <w:tc>
+          <w:tcPr/>
+          <w:p>
+            <w:pPr>
+              <w:pStyle w:val="Compact"/>
+            </w:pPr>
+            <w:r>
+              <w:t xml:space="preserve">Business case and options appraisal</w:t>
+            </w:r>
+          </w:p>
+        </w:tc>
+        <w:tc>
+          <w:tcPr/>
+          <w:p>
+            <w:pPr>
+              <w:pStyle w:val="Compact"/>
+            </w:pPr>
+            <w:r>
+              <w:t xml:space="preserve">Economy, effectiveness, cost-effectiveness.</w:t>
+            </w:r>
+          </w:p>
+        </w:tc>
+        <w:tc>
+          <w:tcPr/>
+          <w:p>
+            <w:pPr>
+              <w:pStyle w:val="Compact"/>
+            </w:pPr>
+            <w:r>
+              <w:t xml:space="preserve">Check objectives, option set, critical success factors, appraisal boundary, treatment of unmonetised value, sensitivity, and optimism bias.</w:t>
+            </w:r>
+          </w:p>
+        </w:tc>
+        <w:tc>
+          <w:tcPr/>
+          <w:p>
+            <w:pPr>
+              <w:pStyle w:val="Compact"/>
+            </w:pPr>
+            <w:r>
+              <w:t xml:space="preserve">Forecast evidence may not match delivery reality.</w:t>
+            </w:r>
+          </w:p>
+        </w:tc>
+        <w:tc>
+          <w:tcPr/>
+          <w:p>
+            <w:pPr>
+              <w:pStyle w:val="Compact"/>
+            </w:pPr>
+            <w:r>
+              <w:t xml:space="preserve">Establish expected value, alternatives, and assumptions to test.</w:t>
+            </w:r>
+          </w:p>
+        </w:tc>
+      </w:tr>
+      <w:tr>
+        <w:tc>
+          <w:tcPr/>
+          <w:p>
+            <w:pPr>
+              <w:pStyle w:val="Compact"/>
+            </w:pPr>
+            <w:r>
+              <w:t xml:space="preserve">Whole-life cost and should-cost models</w:t>
+            </w:r>
+          </w:p>
+        </w:tc>
+        <w:tc>
+          <w:tcPr/>
+          <w:p>
+            <w:pPr>
+              <w:pStyle w:val="Compact"/>
+            </w:pPr>
+            <w:r>
+              <w:t xml:space="preserve">Economy and cost-effectiveness.</w:t>
+            </w:r>
+          </w:p>
+        </w:tc>
+        <w:tc>
+          <w:tcPr/>
+          <w:p>
+            <w:pPr>
+              <w:pStyle w:val="Compact"/>
+            </w:pPr>
+            <w:r>
+              <w:t xml:space="preserve">Check cost completeness, base date, inflation, hidden costs, common costs, transfer payments, risk, assurance, and treatment of retained-client costs.</w:t>
+            </w:r>
+          </w:p>
+        </w:tc>
+        <w:tc>
+          <w:tcPr/>
+          <w:p>
+            <w:pPr>
+              <w:pStyle w:val="Compact"/>
+            </w:pPr>
+            <w:r>
+              <w:t xml:space="preserve">Future operating, upgrade, or dependency costs may be immature.</w:t>
+            </w:r>
+          </w:p>
+        </w:tc>
+        <w:tc>
+          <w:tcPr/>
+          <w:p>
+            <w:pPr>
+              <w:pStyle w:val="Compact"/>
+            </w:pPr>
+            <w:r>
+              <w:t xml:space="preserve">Judge cost realism, affordability, and false economy risk.</w:t>
+            </w:r>
+          </w:p>
+        </w:tc>
+      </w:tr>
+      <w:tr>
+        <w:tc>
+          <w:tcPr/>
+          <w:p>
+            <w:pPr>
+              <w:pStyle w:val="Compact"/>
+            </w:pPr>
+            <w:r>
+              <w:t xml:space="preserve">Efficiency and benefits records</w:t>
+            </w:r>
+          </w:p>
+        </w:tc>
+        <w:tc>
+          <w:tcPr/>
+          <w:p>
+            <w:pPr>
+              <w:pStyle w:val="Compact"/>
+            </w:pPr>
+            <w:r>
+              <w:t xml:space="preserve">Efficiency and cost-effectiveness.</w:t>
+            </w:r>
+          </w:p>
+        </w:tc>
+        <w:tc>
+          <w:tcPr/>
+          <w:p>
+            <w:pPr>
+              <w:pStyle w:val="Compact"/>
+            </w:pPr>
+            <w:r>
+              <w:t xml:space="preserve">Check baseline, counterfactual, gross and net treatment, costs to deliver, recurrence, double counting, and no adverse outcome impact.</w:t>
+            </w:r>
+          </w:p>
+        </w:tc>
+        <w:tc>
+          <w:tcPr/>
+          <w:p>
+            <w:pPr>
+              <w:pStyle w:val="Compact"/>
+            </w:pPr>
+            <w:r>
+              <w:t xml:space="preserve">Savings may be forecast, deferred, shifted, or dependent on unproven service changes.</w:t>
+            </w:r>
+          </w:p>
+        </w:tc>
+        <w:tc>
+          <w:tcPr/>
+          <w:p>
+            <w:pPr>
+              <w:pStyle w:val="Compact"/>
+            </w:pPr>
+            <w:r>
+              <w:t xml:space="preserve">Distinguish claimed, forecast, delivered, and assured efficiency.</w:t>
+            </w:r>
+          </w:p>
+        </w:tc>
+      </w:tr>
+      <w:tr>
+        <w:tc>
+          <w:tcPr/>
+          <w:p>
+            <w:pPr>
+              <w:pStyle w:val="Compact"/>
+            </w:pPr>
+            <w:r>
+              <w:t xml:space="preserve">Commercial and supplier evidence</w:t>
+            </w:r>
+          </w:p>
+        </w:tc>
+        <w:tc>
+          <w:tcPr/>
+          <w:p>
+            <w:pPr>
+              <w:pStyle w:val="Compact"/>
+            </w:pPr>
+            <w:r>
+              <w:t xml:space="preserve">Economy, equity, and cost-effectiveness.</w:t>
+            </w:r>
+          </w:p>
+        </w:tc>
+        <w:tc>
+          <w:tcPr/>
+          <w:p>
+            <w:pPr>
+              <w:pStyle w:val="Compact"/>
+            </w:pPr>
+            <w:r>
+              <w:t xml:space="preserve">Check delivery model rationale, market evidence, competition, framework route, bid evaluation, risk allocation, pricing, supplier financial standing, continuity, and benefits ownership.</w:t>
+            </w:r>
+          </w:p>
+        </w:tc>
+        <w:tc>
+          <w:tcPr/>
+          <w:p>
+            <w:pPr>
+              <w:pStyle w:val="Compact"/>
+            </w:pPr>
+            <w:r>
+              <w:t xml:space="preserve">Supplier data may be commercially sensitive or incomplete.</w:t>
+            </w:r>
+          </w:p>
+        </w:tc>
+        <w:tc>
+          <w:tcPr/>
+          <w:p>
+            <w:pPr>
+              <w:pStyle w:val="Compact"/>
+            </w:pPr>
+            <w:r>
+              <w:t xml:space="preserve">Judge whether sourcing choices support sustainable value.</w:t>
+            </w:r>
+          </w:p>
+        </w:tc>
+      </w:tr>
+      <w:tr>
+        <w:tc>
+          <w:tcPr/>
+          <w:p>
+            <w:pPr>
+              <w:pStyle w:val="Compact"/>
+            </w:pPr>
+            <w:r>
+              <w:t xml:space="preserve">Operational, user, and service evidence</w:t>
+            </w:r>
+          </w:p>
+        </w:tc>
+        <w:tc>
+          <w:tcPr/>
+          <w:p>
+            <w:pPr>
+              <w:pStyle w:val="Compact"/>
+            </w:pPr>
+            <w:r>
+              <w:t xml:space="preserve">Effectiveness, equity, and cost-effectiveness.</w:t>
+            </w:r>
+          </w:p>
+        </w:tc>
+        <w:tc>
+          <w:tcPr/>
+          <w:p>
+            <w:pPr>
+              <w:pStyle w:val="Compact"/>
+            </w:pPr>
+            <w:r>
+              <w:t xml:space="preserve">Check relevance to operational conditions, user groups, readiness, quality, safety, cyber, security, and maintainability.</w:t>
+            </w:r>
+          </w:p>
+        </w:tc>
+        <w:tc>
+          <w:tcPr/>
+          <w:p>
+            <w:pPr>
+              <w:pStyle w:val="Compact"/>
+            </w:pPr>
+            <w:r>
+              <w:t xml:space="preserve">Trials or service data may not represent deployed conditions or all users.</w:t>
+            </w:r>
+          </w:p>
+        </w:tc>
+        <w:tc>
+          <w:tcPr/>
+          <w:p>
+            <w:pPr>
+              <w:pStyle w:val="Compact"/>
+            </w:pPr>
+            <w:r>
+              <w:t xml:space="preserve">Judge whether outputs plausibly create intended defence value.</w:t>
+            </w:r>
+          </w:p>
+        </w:tc>
+      </w:tr>
+      <w:tr>
+        <w:tc>
+          <w:tcPr/>
+          <w:p>
+            <w:pPr>
+              <w:pStyle w:val="Compact"/>
+            </w:pPr>
+            <w:r>
+              <w:t xml:space="preserve">Stakeholder and qualitative evidence</w:t>
+            </w:r>
+          </w:p>
+        </w:tc>
+        <w:tc>
+          <w:tcPr/>
+          <w:p>
+            <w:pPr>
+              <w:pStyle w:val="Compact"/>
+            </w:pPr>
+            <w:r>
+              <w:t xml:space="preserve">Effectiveness and equity.</w:t>
+            </w:r>
+          </w:p>
+        </w:tc>
+        <w:tc>
+          <w:tcPr/>
+          <w:p>
+            <w:pPr>
+              <w:pStyle w:val="Compact"/>
+            </w:pPr>
+            <w:r>
+              <w:t xml:space="preserve">Check sampling, perspective coverage, triangulation, dissenting views, and classified or sensitive exclusions.</w:t>
+            </w:r>
+          </w:p>
+        </w:tc>
+        <w:tc>
+          <w:tcPr/>
+          <w:p>
+            <w:pPr>
+              <w:pStyle w:val="Compact"/>
+            </w:pPr>
+            <w:r>
+              <w:t xml:space="preserve">Evidence may be partial or shaped by role, incentives, or access constraints.</w:t>
+            </w:r>
+          </w:p>
+        </w:tc>
+        <w:tc>
+          <w:tcPr/>
+          <w:p>
+            <w:pPr>
+              <w:pStyle w:val="Compact"/>
+            </w:pPr>
+            <w:r>
+              <w:t xml:space="preserve">Explain how and why value is created or blocked.</w:t>
+            </w:r>
+          </w:p>
+        </w:tc>
+      </w:tr>
+    </w:tbl>
+    <w:bookmarkEnd w:id="29"/>
+    <w:bookmarkStart w:id="30" w:name="rubric-readiness-check"/>
+    <w:p>
+      <w:pPr>
+        <w:pStyle w:val="Heading3"/>
+      </w:pPr>
+      <w:r>
+        <w:t xml:space="preserve">Rubric Readiness Check</w:t>
+      </w:r>
+    </w:p>
+    <w:p>
+      <w:pPr>
+        <w:pStyle w:val="FirstParagraph"/>
+      </w:pPr>
+      <w:r>
+        <w:t xml:space="preserve">Before gathering evidence, check that the five-E framework is usable:</w:t>
+      </w:r>
+    </w:p>
+    <w:p>
+      <w:pPr>
+        <w:pStyle w:val="Compact"/>
+        <w:numPr>
+          <w:ilvl w:val="0"/>
+          <w:numId w:val="1005"/>
+        </w:numPr>
+      </w:pPr>
+      <w:r>
+        <w:t xml:space="preserve">each criterion has a programme-specific definition linked to the value proposition;</w:t>
+      </w:r>
+    </w:p>
+    <w:p>
+      <w:pPr>
+        <w:pStyle w:val="Compact"/>
+        <w:numPr>
+          <w:ilvl w:val="0"/>
+          <w:numId w:val="1005"/>
+        </w:numPr>
+      </w:pPr>
+      <w:r>
+        <w:t xml:space="preserve">subcriteria are limited to the material dimensions of value and resource use;</w:t>
+      </w:r>
+    </w:p>
+    <w:p>
+      <w:pPr>
+        <w:pStyle w:val="Compact"/>
+        <w:numPr>
+          <w:ilvl w:val="0"/>
+          <w:numId w:val="1005"/>
+        </w:numPr>
+      </w:pPr>
+      <w:r>
+        <w:t xml:space="preserve">standards describe poor, adequate, good, and excellent performance before evidence is interpreted;</w:t>
+      </w:r>
+    </w:p>
+    <w:p>
+      <w:pPr>
+        <w:pStyle w:val="Compact"/>
+        <w:numPr>
+          <w:ilvl w:val="0"/>
+          <w:numId w:val="1005"/>
+        </w:numPr>
+      </w:pPr>
+      <w:r>
+        <w:t xml:space="preserve">sourcing, risk, resilience, learning, assurance, and evidence quality are located inside the five Es rather than added as extra criteria;</w:t>
+      </w:r>
+    </w:p>
+    <w:p>
+      <w:pPr>
+        <w:pStyle w:val="Compact"/>
+        <w:numPr>
+          <w:ilvl w:val="0"/>
+          <w:numId w:val="1005"/>
+        </w:numPr>
+      </w:pPr>
+      <w:r>
+        <w:t xml:space="preserve">efficiency or savings claims have planned evidence for baselines, counterfactuals, netting, recurrence, double counting, and outcome protection;</w:t>
+      </w:r>
+    </w:p>
+    <w:p>
+      <w:pPr>
+        <w:pStyle w:val="Compact"/>
+        <w:numPr>
+          <w:ilvl w:val="0"/>
+          <w:numId w:val="1005"/>
+        </w:numPr>
+      </w:pPr>
+      <w:r>
+        <w:t xml:space="preserve">commercial value evidence covers delivery model, market health, should-cost, supplier resilience, risk allocation, pricing, KPIs, and benefits realisation where material;</w:t>
+      </w:r>
+    </w:p>
+    <w:p>
+      <w:pPr>
+        <w:pStyle w:val="Compact"/>
+        <w:numPr>
+          <w:ilvl w:val="0"/>
+          <w:numId w:val="1005"/>
+        </w:numPr>
+      </w:pPr>
+      <w:r>
+        <w:t xml:space="preserve">monetised and non-monetised value are both visible;</w:t>
+      </w:r>
+    </w:p>
+    <w:p>
+      <w:pPr>
+        <w:pStyle w:val="Compact"/>
+        <w:numPr>
+          <w:ilvl w:val="0"/>
+          <w:numId w:val="1005"/>
+        </w:numPr>
+      </w:pPr>
+      <w:r>
+        <w:t xml:space="preserve">alternatives, opportunity cost, affordability, uncertainty, distribution, and future liabilities are visible;</w:t>
+      </w:r>
+    </w:p>
+    <w:p>
+      <w:pPr>
+        <w:pStyle w:val="Compact"/>
+        <w:numPr>
+          <w:ilvl w:val="0"/>
+          <w:numId w:val="1005"/>
+        </w:numPr>
+      </w:pPr>
+      <w:r>
+        <w:t xml:space="preserve">known evidence gaps and confidence implications are recorded.</w:t>
+      </w:r>
+    </w:p>
+    <w:bookmarkEnd w:id="30"/>
+    <w:bookmarkStart w:id="31" w:name="gather-evidence"/>
+    <w:p>
+      <w:pPr>
+        <w:pStyle w:val="Heading3"/>
+      </w:pPr>
+      <w:r>
+        <w:t xml:space="preserve">6. Gather Evidence</w:t>
+      </w:r>
+    </w:p>
+    <w:p>
+      <w:pPr>
+        <w:pStyle w:val="FirstParagraph"/>
+      </w:pPr>
+      <w:r>
+        <w:t xml:space="preserve">Collect the agreed evidence in a way that follows the rubric. Survey, interview, document-review, trial-analysis, and administrative-data tools should use headings aligned to the criteria and subcriteria so evidence can be organised efficiently.</w:t>
+      </w:r>
+    </w:p>
+    <w:p>
+      <w:pPr>
+        <w:pStyle w:val="BodyText"/>
+      </w:pPr>
+      <w:r>
+        <w:t xml:space="preserve">Defence evaluations should plan for practical constraints: classified evidence, operational security, small user populations, immature outcome data, long benefit horizons, supplier confidentiality, and contested causal claims. These constraints should be recorded as evidence limitations, not hidden in the final judgement.</w:t>
+      </w:r>
+    </w:p>
+    <w:bookmarkEnd w:id="31"/>
+    <w:bookmarkStart w:id="32" w:name="analyse-evidence"/>
+    <w:p>
+      <w:pPr>
+        <w:pStyle w:val="Heading3"/>
+      </w:pPr>
+      <w:r>
+        <w:t xml:space="preserve">7. Analyse Evidence</w:t>
+      </w:r>
+    </w:p>
+    <w:p>
+      <w:pPr>
+        <w:pStyle w:val="FirstParagraph"/>
+      </w:pPr>
+      <w:r>
+        <w:t xml:space="preserve">Analyse each evidence stream separately before synthesis. Cost data, schedule data, test evidence, operational analysis, user feedback, cyber assurance, estate data, and supplier evidence each need their own quality checks.</w:t>
+      </w:r>
+    </w:p>
+    <w:p>
+      <w:pPr>
+        <w:pStyle w:val="BodyText"/>
+      </w:pPr>
+      <w:r>
+        <w:t xml:space="preserve">This is also where causal inference or contribution analysis should be handled. For some defence questions, a counterfactual may be available through options analysis, historical comparison, allied benchmarking, or status quo modelling. For others, a theory-based contribution claim will be more credible than forced monetisation.</w:t>
+      </w:r>
+    </w:p>
+    <w:bookmarkEnd w:id="32"/>
+    <w:bookmarkStart w:id="33" w:name="synthesize-judgements-and-report"/>
+    <w:p>
+      <w:pPr>
+        <w:pStyle w:val="Heading3"/>
+      </w:pPr>
+      <w:r>
+        <w:t xml:space="preserve">8. Synthesize Judgements and Report</w:t>
+      </w:r>
+    </w:p>
+    <w:p>
+      <w:pPr>
+        <w:pStyle w:val="FirstParagraph"/>
+      </w:pPr>
+      <w:r>
+        <w:t xml:space="preserve">The final VfM judgement should show the reasoning chain:</w:t>
+      </w:r>
+    </w:p>
+    <w:p>
+      <w:pPr>
+        <w:pStyle w:val="Compact"/>
+        <w:numPr>
+          <w:ilvl w:val="0"/>
+          <w:numId w:val="1006"/>
+        </w:numPr>
+      </w:pPr>
+      <w:r>
+        <w:t xml:space="preserve">programme context and theory of change;</w:t>
+      </w:r>
+    </w:p>
+    <w:p>
+      <w:pPr>
+        <w:pStyle w:val="Compact"/>
+        <w:numPr>
+          <w:ilvl w:val="0"/>
+          <w:numId w:val="1006"/>
+        </w:numPr>
+      </w:pPr>
+      <w:r>
+        <w:t xml:space="preserve">value proposition and evaluation questions;</w:t>
+      </w:r>
+    </w:p>
+    <w:p>
+      <w:pPr>
+        <w:pStyle w:val="Compact"/>
+        <w:numPr>
+          <w:ilvl w:val="0"/>
+          <w:numId w:val="1006"/>
+        </w:numPr>
+      </w:pPr>
+      <w:r>
+        <w:t xml:space="preserve">tailored criteria and subcriteria;</w:t>
+      </w:r>
+    </w:p>
+    <w:p>
+      <w:pPr>
+        <w:pStyle w:val="Compact"/>
+        <w:numPr>
+          <w:ilvl w:val="0"/>
+          <w:numId w:val="1006"/>
+        </w:numPr>
+      </w:pPr>
+      <w:r>
+        <w:t xml:space="preserve">agreed standards;</w:t>
+      </w:r>
+    </w:p>
+    <w:p>
+      <w:pPr>
+        <w:pStyle w:val="Compact"/>
+        <w:numPr>
+          <w:ilvl w:val="0"/>
+          <w:numId w:val="1006"/>
+        </w:numPr>
+      </w:pPr>
+      <w:r>
+        <w:t xml:space="preserve">evidence by criterion;</w:t>
+      </w:r>
+    </w:p>
+    <w:p>
+      <w:pPr>
+        <w:pStyle w:val="Compact"/>
+        <w:numPr>
+          <w:ilvl w:val="0"/>
+          <w:numId w:val="1006"/>
+        </w:numPr>
+      </w:pPr>
+      <w:r>
+        <w:t xml:space="preserve">analysis, ratings, and uncertainty;</w:t>
+      </w:r>
+    </w:p>
+    <w:p>
+      <w:pPr>
+        <w:pStyle w:val="Compact"/>
+        <w:numPr>
+          <w:ilvl w:val="0"/>
+          <w:numId w:val="1006"/>
+        </w:numPr>
+      </w:pPr>
+      <w:r>
+        <w:t xml:space="preserve">trade-offs between criteria;</w:t>
+      </w:r>
+    </w:p>
+    <w:p>
+      <w:pPr>
+        <w:pStyle w:val="Compact"/>
+        <w:numPr>
+          <w:ilvl w:val="0"/>
+          <w:numId w:val="1006"/>
+        </w:numPr>
+      </w:pPr>
+      <w:r>
+        <w:t xml:space="preserve">overall judgement;</w:t>
+      </w:r>
+    </w:p>
+    <w:p>
+      <w:pPr>
+        <w:pStyle w:val="Compact"/>
+        <w:numPr>
+          <w:ilvl w:val="0"/>
+          <w:numId w:val="1006"/>
+        </w:numPr>
+      </w:pPr>
+      <w:r>
         <w:t xml:space="preserve">actions to improve future resource use.</w:t>
       </w:r>
     </w:p>
@@ -1114,9 +2374,9 @@
         <w:t xml:space="preserve">Report the answer up front. The report should give clear evidence-supported ratings against the criteria, then show the reasoning and limitations behind those ratings.</w:t>
       </w:r>
     </w:p>
-    <w:bookmarkEnd w:id="30"/>
-    <w:bookmarkEnd w:id="31"/>
-    <w:bookmarkStart w:id="37" w:name="defence-criteria-and-evidence-prompts"/>
+    <w:bookmarkEnd w:id="33"/>
+    <w:bookmarkEnd w:id="34"/>
+    <w:bookmarkStart w:id="40" w:name="defence-criteria-and-evidence-prompts"/>
     <w:p>
       <w:pPr>
         <w:pStyle w:val="Heading2"/>
@@ -1125,7 +2385,7 @@
         <w:t xml:space="preserve">Defence Criteria and Evidence Prompts</w:t>
       </w:r>
     </w:p>
-    <w:bookmarkStart w:id="32" w:name="economy-resource-stewardship"/>
+    <w:bookmarkStart w:id="35" w:name="economy-resource-stewardship"/>
     <w:p>
       <w:pPr>
         <w:pStyle w:val="Heading3"/>
@@ -1212,6 +2472,30 @@
               <w:pStyle w:val="Compact"/>
             </w:pPr>
             <w:r>
+              <w:t xml:space="preserve">Market and delivery model choice</w:t>
+            </w:r>
+          </w:p>
+        </w:tc>
+        <w:tc>
+          <w:tcPr/>
+          <w:p>
+            <w:pPr>
+              <w:pStyle w:val="Compact"/>
+            </w:pPr>
+            <w:r>
+              <w:t xml:space="preserve">Delivery model assessment, market health analysis, framework route rationale, insourcing or outsourcing comparison, early market engagement records.</w:t>
+            </w:r>
+          </w:p>
+        </w:tc>
+      </w:tr>
+      <w:tr>
+        <w:tc>
+          <w:tcPr/>
+          <w:p>
+            <w:pPr>
+              <w:pStyle w:val="Compact"/>
+            </w:pPr>
+            <w:r>
               <w:t xml:space="preserve">Whole-life cost control</w:t>
             </w:r>
           </w:p>
@@ -1284,6 +2568,30 @@
               <w:pStyle w:val="Compact"/>
             </w:pPr>
             <w:r>
+              <w:t xml:space="preserve">Supplier financial standing and continuity</w:t>
+            </w:r>
+          </w:p>
+        </w:tc>
+        <w:tc>
+          <w:tcPr/>
+          <w:p>
+            <w:pPr>
+              <w:pStyle w:val="Compact"/>
+            </w:pPr>
+            <w:r>
+              <w:t xml:space="preserve">Economic and financial standing checks, continuity plans, resolution plans, dependency mapping, critical supplier monitoring.</w:t>
+            </w:r>
+          </w:p>
+        </w:tc>
+      </w:tr>
+      <w:tr>
+        <w:tc>
+          <w:tcPr/>
+          <w:p>
+            <w:pPr>
+              <w:pStyle w:val="Compact"/>
+            </w:pPr>
+            <w:r>
               <w:t xml:space="preserve">Security and quality investment</w:t>
             </w:r>
           </w:p>
@@ -1301,8 +2609,8 @@
         </w:tc>
       </w:tr>
     </w:tbl>
-    <w:bookmarkEnd w:id="32"/>
-    <w:bookmarkStart w:id="33" w:name="efficiency-delivery-and-learning"/>
+    <w:bookmarkEnd w:id="35"/>
+    <w:bookmarkStart w:id="36" w:name="efficiency-delivery-and-learning"/>
     <w:p>
       <w:pPr>
         <w:pStyle w:val="Heading3"/>
@@ -1461,6 +2769,30 @@
               <w:pStyle w:val="Compact"/>
             </w:pPr>
             <w:r>
+              <w:t xml:space="preserve">Valid efficiency and savings claims</w:t>
+            </w:r>
+          </w:p>
+        </w:tc>
+        <w:tc>
+          <w:tcPr/>
+          <w:p>
+            <w:pPr>
+              <w:pStyle w:val="Compact"/>
+            </w:pPr>
+            <w:r>
+              <w:t xml:space="preserve">Baselines, counterfactuals, gross and net savings, costs to deliver, outturns, recurrence evidence, double-counting controls, outcome and quality protection.</w:t>
+            </w:r>
+          </w:p>
+        </w:tc>
+      </w:tr>
+      <w:tr>
+        <w:tc>
+          <w:tcPr/>
+          <w:p>
+            <w:pPr>
+              <w:pStyle w:val="Compact"/>
+            </w:pPr>
+            <w:r>
               <w:t xml:space="preserve">Dynamic and relational efficiency</w:t>
             </w:r>
           </w:p>
@@ -1478,8 +2810,8 @@
         </w:tc>
       </w:tr>
     </w:tbl>
-    <w:bookmarkEnd w:id="33"/>
-    <w:bookmarkStart w:id="34" w:name="effectiveness-operational-value"/>
+    <w:bookmarkEnd w:id="36"/>
+    <w:bookmarkStart w:id="37" w:name="effectiveness-operational-value"/>
     <w:p>
       <w:pPr>
         <w:pStyle w:val="Heading3"/>
@@ -1638,6 +2970,30 @@
               <w:pStyle w:val="Compact"/>
             </w:pPr>
             <w:r>
+              <w:t xml:space="preserve">Service quality and benefits realisation</w:t>
+            </w:r>
+          </w:p>
+        </w:tc>
+        <w:tc>
+          <w:tcPr/>
+          <w:p>
+            <w:pPr>
+              <w:pStyle w:val="Compact"/>
+            </w:pPr>
+            <w:r>
+              <w:t xml:space="preserve">KPI baselines, benefits register, service management data, incident resolution, user satisfaction, quality thresholds, benefits owner evidence.</w:t>
+            </w:r>
+          </w:p>
+        </w:tc>
+      </w:tr>
+      <w:tr>
+        <w:tc>
+          <w:tcPr/>
+          <w:p>
+            <w:pPr>
+              <w:pStyle w:val="Compact"/>
+            </w:pPr>
+            <w:r>
               <w:t xml:space="preserve">Resilience and adaptability</w:t>
             </w:r>
           </w:p>
@@ -1655,8 +3011,8 @@
         </w:tc>
       </w:tr>
     </w:tbl>
-    <w:bookmarkEnd w:id="34"/>
-    <w:bookmarkStart w:id="35" w:name="X324e297b77618b5427d3772886f3fd5f4146ff1"/>
+    <w:bookmarkEnd w:id="37"/>
+    <w:bookmarkStart w:id="38" w:name="X324e297b77618b5427d3772886f3fd5f4146ff1"/>
     <w:p>
       <w:pPr>
         <w:pStyle w:val="Heading3"/>
@@ -1791,6 +3147,30 @@
               <w:pStyle w:val="Compact"/>
             </w:pPr>
             <w:r>
+              <w:t xml:space="preserve">Supplier access and market fairness</w:t>
+            </w:r>
+          </w:p>
+        </w:tc>
+        <w:tc>
+          <w:tcPr/>
+          <w:p>
+            <w:pPr>
+              <w:pStyle w:val="Compact"/>
+            </w:pPr>
+            <w:r>
+              <w:t xml:space="preserve">SME participation, framework access, competition design, barriers to entry, social value evidence, treatment of incumbents and new entrants.</w:t>
+            </w:r>
+          </w:p>
+        </w:tc>
+      </w:tr>
+      <w:tr>
+        <w:tc>
+          <w:tcPr/>
+          <w:p>
+            <w:pPr>
+              <w:pStyle w:val="Compact"/>
+            </w:pPr>
+            <w:r>
               <w:t xml:space="preserve">Industrial and workforce distribution</w:t>
             </w:r>
           </w:p>
@@ -1802,7 +3182,7 @@
               <w:pStyle w:val="Compact"/>
             </w:pPr>
             <w:r>
-              <w:t xml:space="preserve">SME participation, regional effects, skills pipelines, sovereign capability, workshare, supplier resilience.</w:t>
+              <w:t xml:space="preserve">Regional effects, skills pipelines, sovereign capability, workshare, supplier resilience, workforce transition, knowledge transfer.</w:t>
             </w:r>
           </w:p>
         </w:tc>
@@ -1832,8 +3212,8 @@
         </w:tc>
       </w:tr>
     </w:tbl>
-    <w:bookmarkEnd w:id="35"/>
-    <w:bookmarkStart w:id="36" w:name="X0f5a7922d5f345027691b271145375aa107eaec"/>
+    <w:bookmarkEnd w:id="38"/>
+    <w:bookmarkStart w:id="39" w:name="X0f5a7922d5f345027691b271145375aa107eaec"/>
     <w:p>
       <w:pPr>
         <w:pStyle w:val="Heading3"/>
@@ -1931,7 +3311,7 @@
               <w:pStyle w:val="Compact"/>
             </w:pPr>
             <w:r>
-              <w:t xml:space="preserve">Commercial service, allied collaboration, upgrade, lease, off-the-shelf buy, smaller scope, slower delivery, or non-materiel solution.</w:t>
+              <w:t xml:space="preserve">Delivery model assessment; commercial service, allied collaboration, upgrade, lease, framework route, off-the-shelf buy, smaller scope, slower delivery, or non-materiel solution.</w:t>
             </w:r>
           </w:p>
         </w:tc>
@@ -1992,6 +3372,30 @@
               <w:pStyle w:val="Compact"/>
             </w:pPr>
             <w:r>
+              <w:t xml:space="preserve">Commercial value and incentives</w:t>
+            </w:r>
+          </w:p>
+        </w:tc>
+        <w:tc>
+          <w:tcPr/>
+          <w:p>
+            <w:pPr>
+              <w:pStyle w:val="Compact"/>
+            </w:pPr>
+            <w:r>
+              <w:t xml:space="preserve">Bid evaluation evidence, price-quality trade-offs, KPI design, payment mechanism, risk pricing, benefits realisation, contract management evidence.</w:t>
+            </w:r>
+          </w:p>
+        </w:tc>
+      </w:tr>
+      <w:tr>
+        <w:tc>
+          <w:tcPr/>
+          <w:p>
+            <w:pPr>
+              <w:pStyle w:val="Compact"/>
+            </w:pPr>
+            <w:r>
               <w:t xml:space="preserve">Uncertainty and sensitivity</w:t>
             </w:r>
           </w:p>
@@ -2009,9 +3413,9 @@
         </w:tc>
       </w:tr>
     </w:tbl>
-    <w:bookmarkEnd w:id="36"/>
-    <w:bookmarkEnd w:id="37"/>
-    <w:bookmarkStart w:id="41" w:name="applying-the-guidance-by-programme-type"/>
+    <w:bookmarkEnd w:id="39"/>
+    <w:bookmarkEnd w:id="40"/>
+    <w:bookmarkStart w:id="42" w:name="applying-the-guidance-by-programme-type"/>
     <w:p>
       <w:pPr>
         <w:pStyle w:val="Heading2"/>
@@ -2020,13 +3424,13 @@
         <w:t xml:space="preserve">Applying the Guidance by Programme Type</w:t>
       </w:r>
     </w:p>
-    <w:bookmarkStart w:id="38" w:name="major-capability-platforms"/>
+    <w:bookmarkStart w:id="41" w:name="programme-contexts-and-vfm-emphasis"/>
     <w:p>
       <w:pPr>
         <w:pStyle w:val="Heading3"/>
       </w:pPr>
       <w:r>
-        <w:t xml:space="preserve">Major Capability Platforms</w:t>
+        <w:t xml:space="preserve">Programme Contexts and VfM Emphasis</w:t>
       </w:r>
     </w:p>
     <w:p>
@@ -2034,7 +3438,7 @@
         <w:pStyle w:val="FirstParagraph"/>
       </w:pPr>
       <w:r>
-        <w:t xml:space="preserve">For combat air, submarines, destroyers, armoured vehicles, and similar platforms, use the platform descriptions as adaptation prompts rather than generic case studies.</w:t>
+        <w:t xml:space="preserve">Use the programme descriptions as adaptation prompts rather than generic case studies. The point is to tailor the VfM framework to the main value mechanism, delivery constraints, users, and alternatives for the programme being assessed.</w:t>
       </w:r>
     </w:p>
     <w:tbl>
@@ -2171,13 +3575,85 @@
           </w:p>
         </w:tc>
       </w:tr>
+      <w:tr>
+        <w:tc>
+          <w:tcPr/>
+          <w:p>
+            <w:pPr>
+              <w:pStyle w:val="Compact"/>
+            </w:pPr>
+            <w:r>
+              <w:t xml:space="preserve">Digital and cyber programmes</w:t>
+            </w:r>
+          </w:p>
+        </w:tc>
+        <w:tc>
+          <w:tcPr/>
+          <w:p>
+            <w:pPr>
+              <w:pStyle w:val="Compact"/>
+            </w:pPr>
+            <w:r>
+              <w:t xml:space="preserve">Data, connectivity, software quality, cyber and anti-jamming resilience, user adoption, service reliability, security accreditation, interoperability, technology refresh, open standards, and avoidance of supplier lock-in.</w:t>
+            </w:r>
+          </w:p>
+        </w:tc>
+      </w:tr>
+      <w:tr>
+        <w:tc>
+          <w:tcPr/>
+          <w:p>
+            <w:pPr>
+              <w:pStyle w:val="Compact"/>
+            </w:pPr>
+            <w:r>
+              <w:t xml:space="preserve">Infrastructure and estate programmes</w:t>
+            </w:r>
+          </w:p>
+        </w:tc>
+        <w:tc>
+          <w:tcPr/>
+          <w:p>
+            <w:pPr>
+              <w:pStyle w:val="Compact"/>
+            </w:pPr>
+            <w:r>
+              <w:t xml:space="preserve">Whole-life asset cost, planning and environmental constraints, construction and transition risk, maintainability, occupancy, user experience, community effects, land-disposal value, carbon, biodiversity, and future estate liabilities.</w:t>
+            </w:r>
+          </w:p>
+        </w:tc>
+      </w:tr>
+      <w:tr>
+        <w:tc>
+          <w:tcPr/>
+          <w:p>
+            <w:pPr>
+              <w:pStyle w:val="Compact"/>
+            </w:pPr>
+            <w:r>
+              <w:t xml:space="preserve">Major personnel programmes</w:t>
+            </w:r>
+          </w:p>
+        </w:tc>
+        <w:tc>
+          <w:tcPr/>
+          <w:p>
+            <w:pPr>
+              <w:pStyle w:val="Compact"/>
+            </w:pPr>
+            <w:r>
+              <w:t xml:space="preserve">Workforce demand forecasting, attraction, selection, medical and security vetting, onboarding, training pipeline capacity, candidate experience, diversity and fairness, retention into trained strength, contractor performance, and cost per successful recruit.</w:t>
+            </w:r>
+          </w:p>
+        </w:tc>
+      </w:tr>
     </w:tbl>
     <w:p>
       <w:pPr>
         <w:pStyle w:val="BodyText"/>
       </w:pPr>
       <w:r>
-        <w:t xml:space="preserve">For each platform, define what</w:t>
+        <w:t xml:space="preserve">For each programme, define what</w:t>
       </w:r>
       <w:r>
         <w:t xml:space="preserve"> </w:t>
@@ -2189,22 +3665,29 @@
         <w:t xml:space="preserve"> </w:t>
       </w:r>
       <w:r>
-        <w:t xml:space="preserve">means against the actual capability need, not against a generic list of desirable features.</w:t>
-      </w:r>
-    </w:p>
-    <w:bookmarkEnd w:id="38"/>
-    <w:bookmarkStart w:id="39" w:name="digital-and-cyber-programmes"/>
-    <w:p>
-      <w:pPr>
-        <w:pStyle w:val="Heading3"/>
-      </w:pPr>
-      <w:r>
-        <w:t xml:space="preserve">Digital and Cyber Programmes</w:t>
-      </w:r>
-    </w:p>
-    <w:p>
-      <w:pPr>
-        <w:pStyle w:val="FirstParagraph"/>
+        <w:t xml:space="preserve">means against the intended defence outcome and programme-specific value proposition, not against a generic list of desirable features.</w:t>
+      </w:r>
+    </w:p>
+    <w:p>
+      <w:pPr>
+        <w:pStyle w:val="BodyText"/>
+      </w:pPr>
+      <w:r>
+        <w:t xml:space="preserve">Major capability programmes usually create value by integrating equipment, people, information, support, doctrine, and industrial capacity into an operational effect. Crowsnest illustrates the point because it was intended to provide airborne surveillance, control, and early warning for Carrier Strike by fitting radar and mission-system equipment to Merlin helicopters</w:t>
+      </w:r>
+      <w:r>
+        <w:t xml:space="preserve"> </w:t>
+      </w:r>
+      <w:r>
+        <w:t xml:space="preserve">(National Audit Office 2020)</w:t>
+      </w:r>
+      <w:r>
+        <w:t xml:space="preserve">. A VfM assessment should therefore look beyond whether a sensor was procured. It should test whether the role-fit works with the aircraft, crews, ships, command-and-control arrangements, training pipeline, support model, and deployment schedule; whether delays or integration compromises created a capability gap or reduced operational availability; and whether the chosen approach remained preferable to alternatives once through-life cost, upgrade path, and dependencies with the wider carrier strike system are considered.</w:t>
+      </w:r>
+    </w:p>
+    <w:p>
+      <w:pPr>
+        <w:pStyle w:val="BodyText"/>
       </w:pPr>
       <w:r>
         <w:t xml:space="preserve">Digital programmes create value through data, connectivity, software, resilience, and user adoption. They need VfM criteria that recognise rapid technology cycles and cyber risk.</w:t>
@@ -2232,16 +3715,7 @@
         <w:pStyle w:val="BodyText"/>
       </w:pPr>
       <w:r>
-        <w:t xml:space="preserve">LETacCIS is another useful example. MOD describes it as a land tactical communications programme delivered by Army Headquarters and Defence Digital’s Tactical Systems Service Executive with industry partners, including projects such as MORPHEUS, TRINITY, and Dismounted Situational Awareness</w:t>
-      </w:r>
-      <w:r>
-        <w:t xml:space="preserve"> </w:t>
-      </w:r>
-      <w:r>
-        <w:t xml:space="preserve">(Ministry of Defence 2023)</w:t>
-      </w:r>
-      <w:r>
-        <w:t xml:space="preserve">. A VfM assessment should test whether modular delivery, multi-vendor coordination, open standards, data integrity, tactical usability, and cyber resilience are improving decision-making for users at reasonable cost.</w:t>
+        <w:t xml:space="preserve">Do not treat system uptime, agile velocity, or licence cost as sufficient VfM evidence by themselves. Digital VfM depends on whether users can exploit the system securely and reliably in operational conditions.</w:t>
       </w:r>
     </w:p>
     <w:p>
@@ -2249,22 +3723,12 @@
         <w:pStyle w:val="BodyText"/>
       </w:pPr>
       <w:r>
-        <w:t xml:space="preserve">Do not treat system uptime, agile velocity, or licence cost as sufficient VfM evidence by themselves. Digital VfM depends on whether users can exploit the system securely and reliably in operational conditions.</w:t>
-      </w:r>
-    </w:p>
-    <w:bookmarkEnd w:id="39"/>
-    <w:bookmarkStart w:id="40" w:name="infrastructure-and-estate-programmes"/>
-    <w:p>
-      <w:pPr>
-        <w:pStyle w:val="Heading3"/>
-      </w:pPr>
-      <w:r>
-        <w:t xml:space="preserve">Infrastructure and Estate Programmes</w:t>
-      </w:r>
-    </w:p>
-    <w:p>
-      <w:pPr>
-        <w:pStyle w:val="FirstParagraph"/>
+        <w:t xml:space="preserve">A digital support contract shows how sourcing and GEF prompts can be absorbed into the existing five Es without creating new criteria. Economy would test the delivery model, framework route, should-cost model, retained-client cost, supplier standing, and false economy risks. Efficiency would test whether claimed savings are supported by a credible baseline, counterfactual, costs to deliver, recurrence, double-counting controls, and protected service quality. Effectiveness would test incident resolution, cyber compliance, service availability, user experience, and benefits realisation. Equity would test whether risk, workload, access, and service burdens are shifted unfairly to users, maintainers, smaller suppliers, or future budgets. Cost-effectiveness would test whether the whole-life cost is justified by better support, reduced duplication, cyber assurance, and credible alternatives.</w:t>
+      </w:r>
+    </w:p>
+    <w:p>
+      <w:pPr>
+        <w:pStyle w:val="BodyText"/>
       </w:pPr>
       <w:r>
         <w:t xml:space="preserve">Infrastructure programmes create value through places where personnel live, train, work, and operate. They need VfM criteria that account for long asset lives, planning and environmental constraints, communities, maintainability, and user experience.</w:t>
@@ -2290,7 +3754,7 @@
         <w:t xml:space="preserve"> </w:t>
       </w:r>
       <w:r>
-        <w:t xml:space="preserve">(National Audit Office 2021b)</w:t>
+        <w:t xml:space="preserve">(National Audit Office 2021)</w:t>
       </w:r>
       <w:r>
         <w:t xml:space="preserve">.</w:t>
@@ -2301,30 +3765,29 @@
         <w:pStyle w:val="BodyText"/>
       </w:pPr>
       <w:r>
-        <w:t xml:space="preserve">Single Living Accommodation Modernisation shows the need to evaluate outputs and outcomes separately. DIO reported that Project SLAM built or refurbished more than 22,800 bedspaces across 52 locations, with a construction spend of nearly £1.3 billion and extensive use of modular construction</w:t>
-      </w:r>
-      <w:r>
-        <w:t xml:space="preserve"> </w:t>
-      </w:r>
-      <w:r>
-        <w:t xml:space="preserve">(DIO Communications Team 2015)</w:t>
-      </w:r>
-      <w:r>
-        <w:t xml:space="preserve">. The NAO later found persistent single living accommodation problems, including low-quality accommodation and under-occupancy</w:t>
-      </w:r>
-      <w:r>
-        <w:t xml:space="preserve"> </w:t>
-      </w:r>
-      <w:r>
-        <w:t xml:space="preserve">(National Audit Office 2021a)</w:t>
-      </w:r>
-      <w:r>
-        <w:t xml:space="preserve">. A VfM judgement should therefore ask not only whether rooms were delivered efficiently, but whether the accommodation system as a whole produced sustained improvements in quality, occupancy, welfare, retention, and maintenance burden.</w:t>
-      </w:r>
-    </w:p>
-    <w:bookmarkEnd w:id="40"/>
+        <w:t xml:space="preserve">Major personnel programmes create value by sustaining the workforce needed for defence outputs. The Armed Forces Recruiting Programme is a useful example because the evaluation plan frames it as a move from three separate recruitment processes to a tri-service recruitment approach, supported by recruitment, transition, digital, data, estate, and cross-government inputs</w:t>
+      </w:r>
+      <w:r>
+        <w:t xml:space="preserve"> </w:t>
+      </w:r>
+      <w:r>
+        <w:t xml:space="preserve">(Ministry of Defence 2024)</w:t>
+      </w:r>
+      <w:r>
+        <w:t xml:space="preserve">. A VfM assessment should therefore test whether recruitment resources increase the number, quality, suitability, and timeliness of recruits who progress into initial training and trained strength, while reducing candidate leakage, duplicated effort, avoidable estate cost, data inconsistency, and unfair barriers. It should not treat applications, marketing reach, or starts as sufficient evidence by themselves. The judgement needs to distinguish intermediate recruitment activity from the personnel outcomes that matter for readiness, resilience, diversity, and scarce skills.</w:t>
+      </w:r>
+    </w:p>
+    <w:p>
+      <w:pPr>
+        <w:pStyle w:val="BodyText"/>
+      </w:pPr>
+      <w:r>
+        <w:t xml:space="preserve">Programme types often overlap. A recruitment programme may depend on digital services, medical assessment capacity, estate choices, and training pipeline constraints. A cyber programme may include infrastructure, supplier, workforce, and operational-change elements. Evaluators should therefore tailor the criteria to the value mechanism and decision context rather than relying on the programme label.</w:t>
+      </w:r>
+    </w:p>
     <w:bookmarkEnd w:id="41"/>
-    <w:bookmarkStart w:id="42" w:name="reporting-template"/>
+    <w:bookmarkEnd w:id="42"/>
+    <w:bookmarkStart w:id="43" w:name="reporting-template"/>
     <w:p>
       <w:pPr>
         <w:pStyle w:val="Heading2"/>
@@ -2346,7 +3809,7 @@
         <w:pStyle w:val="Compact"/>
         <w:numPr>
           <w:ilvl w:val="0"/>
-          <w:numId w:val="1005"/>
+          <w:numId w:val="1007"/>
         </w:numPr>
       </w:pPr>
       <w:r>
@@ -2368,7 +3831,7 @@
         <w:pStyle w:val="Compact"/>
         <w:numPr>
           <w:ilvl w:val="0"/>
-          <w:numId w:val="1005"/>
+          <w:numId w:val="1007"/>
         </w:numPr>
       </w:pPr>
       <w:r>
@@ -2390,7 +3853,7 @@
         <w:pStyle w:val="Compact"/>
         <w:numPr>
           <w:ilvl w:val="0"/>
-          <w:numId w:val="1005"/>
+          <w:numId w:val="1007"/>
         </w:numPr>
       </w:pPr>
       <w:r>
@@ -2412,7 +3875,7 @@
         <w:pStyle w:val="Compact"/>
         <w:numPr>
           <w:ilvl w:val="0"/>
-          <w:numId w:val="1005"/>
+          <w:numId w:val="1007"/>
         </w:numPr>
       </w:pPr>
       <w:r>
@@ -2434,7 +3897,7 @@
         <w:pStyle w:val="Compact"/>
         <w:numPr>
           <w:ilvl w:val="0"/>
-          <w:numId w:val="1005"/>
+          <w:numId w:val="1007"/>
         </w:numPr>
       </w:pPr>
       <w:r>
@@ -2456,7 +3919,7 @@
         <w:pStyle w:val="Compact"/>
         <w:numPr>
           <w:ilvl w:val="0"/>
-          <w:numId w:val="1005"/>
+          <w:numId w:val="1007"/>
         </w:numPr>
       </w:pPr>
       <w:r>
@@ -2478,7 +3941,7 @@
         <w:pStyle w:val="Compact"/>
         <w:numPr>
           <w:ilvl w:val="0"/>
-          <w:numId w:val="1005"/>
+          <w:numId w:val="1007"/>
         </w:numPr>
       </w:pPr>
       <w:r>
@@ -2492,7 +3955,7 @@
         <w:t xml:space="preserve"> </w:t>
       </w:r>
       <w:r>
-        <w:t xml:space="preserve">What evidence was used, what was missing, and how credible is it?</w:t>
+        <w:t xml:space="preserve">What evidence was used, what quality checks were applied, what was missing, and how credible is it?</w:t>
       </w:r>
     </w:p>
     <w:p>
@@ -2500,7 +3963,7 @@
         <w:pStyle w:val="Compact"/>
         <w:numPr>
           <w:ilvl w:val="0"/>
-          <w:numId w:val="1005"/>
+          <w:numId w:val="1007"/>
         </w:numPr>
       </w:pPr>
       <w:r>
@@ -2522,7 +3985,7 @@
         <w:pStyle w:val="Compact"/>
         <w:numPr>
           <w:ilvl w:val="0"/>
-          <w:numId w:val="1005"/>
+          <w:numId w:val="1007"/>
         </w:numPr>
       </w:pPr>
       <w:r>
@@ -2544,7 +4007,7 @@
         <w:pStyle w:val="Compact"/>
         <w:numPr>
           <w:ilvl w:val="0"/>
-          <w:numId w:val="1005"/>
+          <w:numId w:val="1007"/>
         </w:numPr>
       </w:pPr>
       <w:r>
@@ -2566,7 +4029,7 @@
         <w:pStyle w:val="Compact"/>
         <w:numPr>
           <w:ilvl w:val="0"/>
-          <w:numId w:val="1005"/>
+          <w:numId w:val="1007"/>
         </w:numPr>
       </w:pPr>
       <w:r>
@@ -2583,8 +4046,8 @@
         <w:t xml:space="preserve">What should change in delivery, future approvals, commercial strategy, data, evaluation, or portfolio decisions?</w:t>
       </w:r>
     </w:p>
-    <w:bookmarkEnd w:id="42"/>
-    <w:bookmarkStart w:id="43" w:name="common-risks"/>
+    <w:bookmarkEnd w:id="43"/>
+    <w:bookmarkStart w:id="44" w:name="common-risks"/>
     <w:p>
       <w:pPr>
         <w:pStyle w:val="Heading2"/>
@@ -2598,7 +4061,7 @@
         <w:pStyle w:val="Compact"/>
         <w:numPr>
           <w:ilvl w:val="0"/>
-          <w:numId w:val="1006"/>
+          <w:numId w:val="1008"/>
         </w:numPr>
       </w:pPr>
       <w:r>
@@ -2610,7 +4073,7 @@
         <w:pStyle w:val="Compact"/>
         <w:numPr>
           <w:ilvl w:val="0"/>
-          <w:numId w:val="1006"/>
+          <w:numId w:val="1008"/>
         </w:numPr>
       </w:pPr>
       <w:r>
@@ -2622,7 +4085,7 @@
         <w:pStyle w:val="Compact"/>
         <w:numPr>
           <w:ilvl w:val="0"/>
-          <w:numId w:val="1006"/>
+          <w:numId w:val="1008"/>
         </w:numPr>
       </w:pPr>
       <w:r>
@@ -2634,7 +4097,7 @@
         <w:pStyle w:val="Compact"/>
         <w:numPr>
           <w:ilvl w:val="0"/>
-          <w:numId w:val="1006"/>
+          <w:numId w:val="1008"/>
         </w:numPr>
       </w:pPr>
       <w:r>
@@ -2646,7 +4109,7 @@
         <w:pStyle w:val="Compact"/>
         <w:numPr>
           <w:ilvl w:val="0"/>
-          <w:numId w:val="1006"/>
+          <w:numId w:val="1008"/>
         </w:numPr>
       </w:pPr>
       <w:r>
@@ -2658,7 +4121,7 @@
         <w:pStyle w:val="Compact"/>
         <w:numPr>
           <w:ilvl w:val="0"/>
-          <w:numId w:val="1006"/>
+          <w:numId w:val="1008"/>
         </w:numPr>
       </w:pPr>
       <w:r>
@@ -2670,15 +4133,51 @@
         <w:pStyle w:val="Compact"/>
         <w:numPr>
           <w:ilvl w:val="0"/>
-          <w:numId w:val="1006"/>
+          <w:numId w:val="1008"/>
         </w:numPr>
       </w:pPr>
       <w:r>
         <w:t xml:space="preserve">Confusing delivery outputs with sustained operational or welfare outcomes.</w:t>
       </w:r>
     </w:p>
-    <w:bookmarkEnd w:id="43"/>
-    <w:bookmarkStart w:id="44" w:name="conclusion"/>
+    <w:p>
+      <w:pPr>
+        <w:pStyle w:val="Compact"/>
+        <w:numPr>
+          <w:ilvl w:val="0"/>
+          <w:numId w:val="1008"/>
+        </w:numPr>
+      </w:pPr>
+      <w:r>
+        <w:t xml:space="preserve">Treating underspend, deferral, cancellation, cost shifting, or unsupported forecast savings as efficiency.</w:t>
+      </w:r>
+    </w:p>
+    <w:p>
+      <w:pPr>
+        <w:pStyle w:val="Compact"/>
+        <w:numPr>
+          <w:ilvl w:val="0"/>
+          <w:numId w:val="1008"/>
+        </w:numPr>
+      </w:pPr>
+      <w:r>
+        <w:t xml:space="preserve">Treating procurement compliance, bid scores, or contract award as enough evidence of commercial value.</w:t>
+      </w:r>
+    </w:p>
+    <w:p>
+      <w:pPr>
+        <w:pStyle w:val="Compact"/>
+        <w:numPr>
+          <w:ilvl w:val="0"/>
+          <w:numId w:val="1008"/>
+        </w:numPr>
+      </w:pPr>
+      <w:r>
+        <w:t xml:space="preserve">Ignoring evidence limitations where data are classified, commercially sensitive, immature, or not representative of operational conditions.</w:t>
+      </w:r>
+    </w:p>
+    <w:bookmarkEnd w:id="44"/>
+    <w:bookmarkStart w:id="45" w:name="conclusion"/>
     <w:p>
       <w:pPr>
         <w:pStyle w:val="Heading2"/>
@@ -2703,93 +4202,264 @@
         <w:t xml:space="preserve">Evaluators should therefore design VfM assessment as a transparent reasoning process. The question is not simply whether the programme spent less, delivered more, or produced a favourable ratio. It is whether the total resource use was justified by the operational, organisational, strategic, social, environmental, and future value created.</w:t>
       </w:r>
     </w:p>
-    <w:bookmarkEnd w:id="44"/>
-    <w:bookmarkStart w:id="62" w:name="references"/>
-    <w:p>
-      <w:pPr>
-        <w:pStyle w:val="Heading2"/>
-      </w:pPr>
-      <w:r>
-        <w:t xml:space="preserve">References</w:t>
-      </w:r>
-    </w:p>
-    <w:bookmarkStart w:id="61" w:name="refs"/>
-    <w:bookmarkStart w:id="46" w:name="ref-dio_communications_team_2015_slam"/>
-    <w:p>
-      <w:pPr>
-        <w:pStyle w:val="Bibliography"/>
-      </w:pPr>
-      <w:r>
-        <w:t xml:space="preserve">DIO Communications Team. 2015.</w:t>
-      </w:r>
-      <w:r>
-        <w:t xml:space="preserve"> </w:t>
-      </w:r>
-      <w:r>
-        <w:t xml:space="preserve">“</w:t>
-      </w:r>
-      <w:r>
-        <w:t xml:space="preserve">1.3Bn Project to Improve Military Accommodation Comes to a Close.”</w:t>
-      </w:r>
-      <w:r>
-        <w:t xml:space="preserve"> </w:t>
-      </w:r>
-      <w:r>
-        <w:t xml:space="preserve">Inside DIO.</w:t>
-      </w:r>
-      <w:r>
-        <w:t xml:space="preserve"> </w:t>
-      </w:r>
-      <w:hyperlink r:id="rId45">
+    <w:p>
+      <w:pPr>
+        <w:pStyle w:val="BodyText"/>
+      </w:pPr>
+      <w:r>
+        <w:t xml:space="preserve">For detailed guidance on generating the rubric architecture before applying it, see the</w:t>
+      </w:r>
+      <w:r>
+        <w:t xml:space="preserve"> </w:t>
+      </w:r>
+      <w:hyperlink r:id="rId20">
         <w:r>
           <w:rPr>
             <w:rStyle w:val="Hyperlink"/>
           </w:rPr>
-          <w:t xml:space="preserve">https://insidedio.blog.gov.uk/2015/12/08/1-3bn-project-to-improve-military-accommodation-comes-to-a-close/</w:t>
+          <w:t xml:space="preserve">Defence VfI Rubric Generation</w:t>
         </w:r>
       </w:hyperlink>
       <w:r>
-        <w:t xml:space="preserve">.</w:t>
-      </w:r>
-    </w:p>
-    <w:bookmarkEnd w:id="46"/>
-    <w:bookmarkStart w:id="48" w:name="ref-king_hurrell_2024_verian_vfm"/>
+        <w:t xml:space="preserve"> </w:t>
+      </w:r>
+      <w:r>
+        <w:t xml:space="preserve">report.</w:t>
+      </w:r>
+    </w:p>
+    <w:bookmarkEnd w:id="45"/>
+    <w:bookmarkStart w:id="75" w:name="references"/>
+    <w:p>
+      <w:pPr>
+        <w:pStyle w:val="Heading2"/>
+      </w:pPr>
+      <w:r>
+        <w:t xml:space="preserve">References</w:t>
+      </w:r>
+    </w:p>
+    <w:bookmarkStart w:id="74" w:name="refs"/>
+    <w:bookmarkStart w:id="47" w:name="X93be4269cd951370827431b862f702ad08c3eb7"/>
     <w:p>
       <w:pPr>
         <w:pStyle w:val="Bibliography"/>
       </w:pPr>
       <w:r>
-        <w:t xml:space="preserve">King, Julian, and Alex Hurrell. 2024.</w:t>
-      </w:r>
-      <w:r>
-        <w:t xml:space="preserve"> </w:t>
-      </w:r>
-      <w:r>
-        <w:t xml:space="preserve">“A Guide to Evaluation of Value for Money in UK Public Services: Why Cost-Benefit Analysis Alone May Be Insufficient to Evaluate VfM, and How to Navigate a Solution.”</w:t>
-      </w:r>
-      <w:r>
-        <w:t xml:space="preserve"> </w:t>
-      </w:r>
-      <w:r>
-        <w:t xml:space="preserve">Verian Group.</w:t>
-      </w:r>
-      <w:r>
-        <w:t xml:space="preserve"> </w:t>
-      </w:r>
-      <w:hyperlink r:id="rId47">
+        <w:t xml:space="preserve">Cabinet Office, and Government Commercial Function. 2026.</w:t>
+      </w:r>
+      <w:r>
+        <w:t xml:space="preserve"> </w:t>
+      </w:r>
+      <w:r>
+        <w:rPr>
+          <w:i/>
+          <w:iCs/>
+        </w:rPr>
+        <w:t xml:space="preserve">The Sourcing Playbook</w:t>
+      </w:r>
+      <w:r>
+        <w:t xml:space="preserve">. GOV.UK.</w:t>
+      </w:r>
+      <w:r>
+        <w:t xml:space="preserve"> </w:t>
+      </w:r>
+      <w:hyperlink r:id="rId46">
         <w:r>
           <w:rPr>
             <w:rStyle w:val="Hyperlink"/>
           </w:rPr>
-          <w:t xml:space="preserve">https://www.julianking.co.nz/wp-content/uploads/2024/08/Verian-Group-Value-for-Money-Guide-August-2024.pdf</w:t>
+          <w:t xml:space="preserve">https://www.gov.uk/government/publications/the-sourcing-and-consultancy-playbooks/the-sourcing-playbook-html</w:t>
         </w:r>
       </w:hyperlink>
       <w:r>
         <w:t xml:space="preserve">.</w:t>
       </w:r>
     </w:p>
-    <w:bookmarkEnd w:id="48"/>
-    <w:bookmarkStart w:id="50" w:name="X5aadf329078f129525b6c41d728b99a2680cd7e"/>
+    <w:bookmarkEnd w:id="47"/>
+    <w:bookmarkStart w:id="49" w:name="ref-hm_treasury_2022_green_book_vfm"/>
+    <w:p>
+      <w:pPr>
+        <w:pStyle w:val="Bibliography"/>
+      </w:pPr>
+      <w:r>
+        <w:t xml:space="preserve">HM Treasury. 2022.</w:t>
+      </w:r>
+      <w:r>
+        <w:t xml:space="preserve"> </w:t>
+      </w:r>
+      <w:r>
+        <w:rPr>
+          <w:i/>
+          <w:iCs/>
+        </w:rPr>
+        <w:t xml:space="preserve">Green Book Supplementary Guidance: Value for Money</w:t>
+      </w:r>
+      <w:r>
+        <w:t xml:space="preserve">. GOV.UK.</w:t>
+      </w:r>
+      <w:r>
+        <w:t xml:space="preserve"> </w:t>
+      </w:r>
+      <w:hyperlink r:id="rId48">
+        <w:r>
+          <w:rPr>
+            <w:rStyle w:val="Hyperlink"/>
+          </w:rPr>
+          <w:t xml:space="preserve">https://www.gov.uk/government/publications/green-book-supplementary-guidance-value-for-money</w:t>
+        </w:r>
+      </w:hyperlink>
+      <w:r>
+        <w:t xml:space="preserve">.</w:t>
+      </w:r>
+    </w:p>
+    <w:bookmarkEnd w:id="49"/>
+    <w:bookmarkStart w:id="51" w:name="X229068398a1c533ef91e3d528fd5cc4d464e162"/>
+    <w:p>
+      <w:pPr>
+        <w:pStyle w:val="Bibliography"/>
+      </w:pPr>
+      <w:r>
+        <w:t xml:space="preserve">———. 2025a.</w:t>
+      </w:r>
+      <w:r>
+        <w:t xml:space="preserve"> </w:t>
+      </w:r>
+      <w:r>
+        <w:rPr>
+          <w:i/>
+          <w:iCs/>
+        </w:rPr>
+        <w:t xml:space="preserve">Government Efficiency Framework (GEF) Summary, Key Definitions and Criteria Guide</w:t>
+      </w:r>
+      <w:r>
+        <w:t xml:space="preserve">. GOV.UK.</w:t>
+      </w:r>
+      <w:r>
+        <w:t xml:space="preserve"> </w:t>
+      </w:r>
+      <w:hyperlink r:id="rId50">
+        <w:r>
+          <w:rPr>
+            <w:rStyle w:val="Hyperlink"/>
+          </w:rPr>
+          <w:t xml:space="preserve">https://www.gov.uk/government/publications/the-government-efficiency-framework/government-efficiency-framework-gef-summary-key-definitions-and-criteria-guide</w:t>
+        </w:r>
+      </w:hyperlink>
+      <w:r>
+        <w:t xml:space="preserve">.</w:t>
+      </w:r>
+    </w:p>
+    <w:bookmarkEnd w:id="51"/>
+    <w:bookmarkStart w:id="53" w:name="X8a80f7fc63d5cd2f421f3cafbfac205eb8913e3"/>
+    <w:p>
+      <w:pPr>
+        <w:pStyle w:val="Bibliography"/>
+      </w:pPr>
+      <w:r>
+        <w:t xml:space="preserve">———. 2025b.</w:t>
+      </w:r>
+      <w:r>
+        <w:t xml:space="preserve"> </w:t>
+      </w:r>
+      <w:r>
+        <w:rPr>
+          <w:i/>
+          <w:iCs/>
+        </w:rPr>
+        <w:t xml:space="preserve">The Government Efficiency Framework</w:t>
+      </w:r>
+      <w:r>
+        <w:t xml:space="preserve">. GOV.UK.</w:t>
+      </w:r>
+      <w:r>
+        <w:t xml:space="preserve"> </w:t>
+      </w:r>
+      <w:hyperlink r:id="rId52">
+        <w:r>
+          <w:rPr>
+            <w:rStyle w:val="Hyperlink"/>
+          </w:rPr>
+          <w:t xml:space="preserve">https://www.gov.uk/government/publications/the-government-efficiency-framework/the-government-efficiency-framework--2</w:t>
+        </w:r>
+      </w:hyperlink>
+      <w:r>
+        <w:t xml:space="preserve">.</w:t>
+      </w:r>
+    </w:p>
+    <w:bookmarkEnd w:id="53"/>
+    <w:bookmarkStart w:id="55" w:name="ref-hm_treasury_2026_green_book"/>
+    <w:p>
+      <w:pPr>
+        <w:pStyle w:val="Bibliography"/>
+      </w:pPr>
+      <w:r>
+        <w:t xml:space="preserve">———. 2026.</w:t>
+      </w:r>
+      <w:r>
+        <w:t xml:space="preserve"> </w:t>
+      </w:r>
+      <w:r>
+        <w:rPr>
+          <w:i/>
+          <w:iCs/>
+        </w:rPr>
+        <w:t xml:space="preserve">The Green Book</w:t>
+      </w:r>
+      <w:r>
+        <w:t xml:space="preserve">. GOV.UK.</w:t>
+      </w:r>
+      <w:r>
+        <w:t xml:space="preserve"> </w:t>
+      </w:r>
+      <w:hyperlink r:id="rId54">
+        <w:r>
+          <w:rPr>
+            <w:rStyle w:val="Hyperlink"/>
+          </w:rPr>
+          <w:t xml:space="preserve">https://www.gov.uk/government/publications/the-green-book-appraisal-and-evaluation-in-central-government/the-green-book-2026</w:t>
+        </w:r>
+      </w:hyperlink>
+      <w:r>
+        <w:t xml:space="preserve">.</w:t>
+      </w:r>
+    </w:p>
+    <w:bookmarkEnd w:id="55"/>
+    <w:bookmarkStart w:id="57" w:name="ref-king_hurrell_2024_verian_vfm"/>
+    <w:p>
+      <w:pPr>
+        <w:pStyle w:val="Bibliography"/>
+      </w:pPr>
+      <w:r>
+        <w:t xml:space="preserve">King, Julian, and Alex Hurrell. 2024.</w:t>
+      </w:r>
+      <w:r>
+        <w:t xml:space="preserve"> </w:t>
+      </w:r>
+      <w:r>
+        <w:t xml:space="preserve">“A Guide to Evaluation of Value for Money in UK Public Services: Why Cost-Benefit Analysis Alone May Be Insufficient to Evaluate VfM, and How to Navigate a Solution.”</w:t>
+      </w:r>
+      <w:r>
+        <w:t xml:space="preserve"> </w:t>
+      </w:r>
+      <w:r>
+        <w:t xml:space="preserve">Verian Group.</w:t>
+      </w:r>
+      <w:r>
+        <w:t xml:space="preserve"> </w:t>
+      </w:r>
+      <w:hyperlink r:id="rId56">
+        <w:r>
+          <w:rPr>
+            <w:rStyle w:val="Hyperlink"/>
+          </w:rPr>
+          <w:t xml:space="preserve">https://www.veriangroup.com/hubfs/Verian%20Group%20-%20Value%20for%20Money%20Guide%20-%20August%202024.pdf</w:t>
+        </w:r>
+      </w:hyperlink>
+      <w:r>
+        <w:t xml:space="preserve">.</w:t>
+      </w:r>
+    </w:p>
+    <w:bookmarkEnd w:id="57"/>
+    <w:bookmarkStart w:id="59" w:name="X5aadf329078f129525b6c41d728b99a2680cd7e"/>
     <w:p>
       <w:pPr>
         <w:pStyle w:val="Bibliography"/>
@@ -2813,7 +4483,7 @@
       <w:r>
         <w:t xml:space="preserve"> </w:t>
       </w:r>
-      <w:hyperlink r:id="rId49">
+      <w:hyperlink r:id="rId58">
         <w:r>
           <w:rPr>
             <w:rStyle w:val="Hyperlink"/>
@@ -2825,49 +4495,123 @@
         <w:t xml:space="preserve">.</w:t>
       </w:r>
     </w:p>
-    <w:bookmarkEnd w:id="50"/>
-    <w:bookmarkStart w:id="52" w:name="ref-ministry_of_defence_2023_letaccis"/>
+    <w:bookmarkEnd w:id="59"/>
+    <w:bookmarkStart w:id="61" w:name="X624eaf87768f05d0c16024b60737effd9c51baf"/>
     <w:p>
       <w:pPr>
         <w:pStyle w:val="Bibliography"/>
       </w:pPr>
       <w:r>
-        <w:t xml:space="preserve">Ministry of Defence. 2023.</w:t>
-      </w:r>
-      <w:r>
-        <w:t xml:space="preserve"> </w:t>
-      </w:r>
-      <w:r>
-        <w:t xml:space="preserve">“LETacCIS Programme.”</w:t>
-      </w:r>
-      <w:r>
-        <w:t xml:space="preserve"> </w:t>
-      </w:r>
-      <w:r>
-        <w:t xml:space="preserve">GOV.UK.</w:t>
-      </w:r>
-      <w:r>
-        <w:t xml:space="preserve"> </w:t>
-      </w:r>
-      <w:hyperlink r:id="rId51">
+        <w:t xml:space="preserve">Ministry of Defence. 2014a.</w:t>
+      </w:r>
+      <w:r>
+        <w:t xml:space="preserve"> </w:t>
+      </w:r>
+      <w:r>
+        <w:rPr>
+          <w:i/>
+          <w:iCs/>
+        </w:rPr>
+        <w:t xml:space="preserve">JSP 507: Investment Appraisal and Evaluation, Part 1: Directive</w:t>
+      </w:r>
+      <w:r>
+        <w:t xml:space="preserve">. GOV.UK.</w:t>
+      </w:r>
+      <w:r>
+        <w:t xml:space="preserve"> </w:t>
+      </w:r>
+      <w:hyperlink r:id="rId60">
         <w:r>
           <w:rPr>
             <w:rStyle w:val="Hyperlink"/>
           </w:rPr>
-          <w:t xml:space="preserve">https://www.gov.uk/guidance/le-taccis-programme</w:t>
+          <w:t xml:space="preserve">https://assets.publishing.service.gov.uk/media/5a7cb922ed915d63cc65c75b/JSP507_Part_1_U.pdf</w:t>
         </w:r>
       </w:hyperlink>
       <w:r>
         <w:t xml:space="preserve">.</w:t>
       </w:r>
     </w:p>
-    <w:bookmarkEnd w:id="52"/>
-    <w:bookmarkStart w:id="54" w:name="ref-ministry_of_defence_2025_skynet_6"/>
+    <w:bookmarkEnd w:id="61"/>
+    <w:bookmarkStart w:id="63" w:name="X1b66f7ceda6bdc2d10e2e94ddbe4a773b36ef37"/>
     <w:p>
       <w:pPr>
         <w:pStyle w:val="Bibliography"/>
       </w:pPr>
       <w:r>
+        <w:t xml:space="preserve">———. 2014b.</w:t>
+      </w:r>
+      <w:r>
+        <w:t xml:space="preserve"> </w:t>
+      </w:r>
+      <w:r>
+        <w:rPr>
+          <w:i/>
+          <w:iCs/>
+        </w:rPr>
+        <w:t xml:space="preserve">JSP 507: Investment Appraisal and Evaluation, Part 2: Guidance</w:t>
+      </w:r>
+      <w:r>
+        <w:t xml:space="preserve">. GOV.UK.</w:t>
+      </w:r>
+      <w:r>
+        <w:t xml:space="preserve"> </w:t>
+      </w:r>
+      <w:hyperlink r:id="rId62">
+        <w:r>
+          <w:rPr>
+            <w:rStyle w:val="Hyperlink"/>
+          </w:rPr>
+          <w:t xml:space="preserve">https://assets.publishing.service.gov.uk/government/uploads/system/uploads/attachment_data/file/275550/JSP507_Part_2_U.pdf</w:t>
+        </w:r>
+      </w:hyperlink>
+      <w:r>
+        <w:t xml:space="preserve">.</w:t>
+      </w:r>
+    </w:p>
+    <w:bookmarkEnd w:id="63"/>
+    <w:bookmarkStart w:id="65" w:name="X47dfa4d511a4267de6add2decb4f6587779c7e8"/>
+    <w:p>
+      <w:pPr>
+        <w:pStyle w:val="Bibliography"/>
+      </w:pPr>
+      <w:r>
+        <w:t xml:space="preserve">———. 2024.</w:t>
+      </w:r>
+      <w:r>
+        <w:t xml:space="preserve"> </w:t>
+      </w:r>
+      <w:r>
+        <w:t xml:space="preserve">“Armed Forces Recruitment Programme Evaluation Plan.”</w:t>
+      </w:r>
+      <w:r>
+        <w:t xml:space="preserve"> </w:t>
+      </w:r>
+      <w:r>
+        <w:t xml:space="preserve">GOV.UK.</w:t>
+      </w:r>
+      <w:r>
+        <w:t xml:space="preserve"> </w:t>
+      </w:r>
+      <w:hyperlink r:id="rId64">
+        <w:r>
+          <w:rPr>
+            <w:rStyle w:val="Hyperlink"/>
+          </w:rPr>
+          <w:t xml:space="preserve">https://assets.publishing.service.gov.uk/media/68af14b12f185664821558ca/28-10-2024_AFRP_Evaluation_Plan.pdf</w:t>
+        </w:r>
+      </w:hyperlink>
+      <w:r>
+        <w:t xml:space="preserve">.</w:t>
+      </w:r>
+    </w:p>
+    <w:bookmarkEnd w:id="65"/>
+    <w:bookmarkStart w:id="67" w:name="ref-ministry_of_defence_2025_skynet_6"/>
+    <w:p>
+      <w:pPr>
+        <w:pStyle w:val="Bibliography"/>
+      </w:pPr>
+      <w:r>
         <w:t xml:space="preserve">———. 2025.</w:t>
       </w:r>
       <w:r>
@@ -2885,7 +4629,7 @@
       <w:r>
         <w:t xml:space="preserve"> </w:t>
       </w:r>
-      <w:hyperlink r:id="rId53">
+      <w:hyperlink r:id="rId66">
         <w:r>
           <w:rPr>
             <w:rStyle w:val="Hyperlink"/>
@@ -2897,8 +4641,8 @@
         <w:t xml:space="preserve">.</w:t>
       </w:r>
     </w:p>
-    <w:bookmarkEnd w:id="54"/>
-    <w:bookmarkStart w:id="56" w:name="ref-ministry_of_defence_2026_deo"/>
+    <w:bookmarkEnd w:id="67"/>
+    <w:bookmarkStart w:id="69" w:name="ref-ministry_of_defence_2026_deo"/>
     <w:p>
       <w:pPr>
         <w:pStyle w:val="Bibliography"/>
@@ -2921,7 +4665,7 @@
       <w:r>
         <w:t xml:space="preserve"> </w:t>
       </w:r>
-      <w:hyperlink r:id="rId55">
+      <w:hyperlink r:id="rId68">
         <w:r>
           <w:rPr>
             <w:rStyle w:val="Hyperlink"/>
@@ -2933,20 +4677,20 @@
         <w:t xml:space="preserve">.</w:t>
       </w:r>
     </w:p>
-    <w:bookmarkEnd w:id="56"/>
-    <w:bookmarkStart w:id="58" w:name="X3ba618fd65ff53f8a05c9e8f034398eab7e0471"/>
+    <w:bookmarkEnd w:id="69"/>
+    <w:bookmarkStart w:id="71" w:name="Xbd11a6d9e168c38ccbaf2a0016654810bf18ffd"/>
     <w:p>
       <w:pPr>
         <w:pStyle w:val="Bibliography"/>
       </w:pPr>
       <w:r>
-        <w:t xml:space="preserve">National Audit Office. 2021a.</w:t>
-      </w:r>
-      <w:r>
-        <w:t xml:space="preserve"> </w:t>
-      </w:r>
-      <w:r>
-        <w:t xml:space="preserve">“Improving Single Living Accommodation.”</w:t>
+        <w:t xml:space="preserve">National Audit Office. 2020.</w:t>
+      </w:r>
+      <w:r>
+        <w:t xml:space="preserve"> </w:t>
+      </w:r>
+      <w:r>
+        <w:t xml:space="preserve">“Carrier Strike: Preparing for Deployment.”</w:t>
       </w:r>
       <w:r>
         <w:t xml:space="preserve"> </w:t>
@@ -2957,26 +4701,26 @@
       <w:r>
         <w:t xml:space="preserve"> </w:t>
       </w:r>
-      <w:hyperlink r:id="rId57">
+      <w:hyperlink r:id="rId70">
         <w:r>
           <w:rPr>
             <w:rStyle w:val="Hyperlink"/>
           </w:rPr>
-          <w:t xml:space="preserve">https://www.nao.org.uk/reports/improving-single-living-accommodation/</w:t>
+          <w:t xml:space="preserve">https://www.nao.org.uk/wp-content/uploads/2020/06/007678-001-Carrier-Strike-preparing-for-deployment.pdf</w:t>
         </w:r>
       </w:hyperlink>
       <w:r>
         <w:t xml:space="preserve">.</w:t>
       </w:r>
     </w:p>
-    <w:bookmarkEnd w:id="58"/>
-    <w:bookmarkStart w:id="60" w:name="X096a48d91f7cbd7717748e91aa06c1e1c13d003"/>
+    <w:bookmarkEnd w:id="71"/>
+    <w:bookmarkStart w:id="73" w:name="X096a48d91f7cbd7717748e91aa06c1e1c13d003"/>
     <w:p>
       <w:pPr>
         <w:pStyle w:val="Bibliography"/>
       </w:pPr>
       <w:r>
-        <w:t xml:space="preserve">———. 2021b.</w:t>
+        <w:t xml:space="preserve">———. 2021.</w:t>
       </w:r>
       <w:r>
         <w:t xml:space="preserve"> </w:t>
@@ -2993,7 +4737,7 @@
       <w:r>
         <w:t xml:space="preserve"> </w:t>
       </w:r>
-      <w:hyperlink r:id="rId59">
+      <w:hyperlink r:id="rId72">
         <w:r>
           <w:rPr>
             <w:rStyle w:val="Hyperlink"/>
@@ -3005,9 +4749,9 @@
         <w:t xml:space="preserve">.</w:t>
       </w:r>
     </w:p>
-    <w:bookmarkEnd w:id="60"/>
-    <w:bookmarkEnd w:id="61"/>
-    <w:bookmarkEnd w:id="62"/>
+    <w:bookmarkEnd w:id="73"/>
+    <w:bookmarkEnd w:id="74"/>
+    <w:bookmarkEnd w:id="75"/>
     <w:sectPr>
       <w:footnotePr>
         <w:numRestart w:val="eachSect"/>
@@ -3319,6 +5063,12 @@
     <w:abstractNumId w:val="991"/>
   </w:num>
   <w:num w:numId="1004">
+    <w:abstractNumId w:val="991"/>
+  </w:num>
+  <w:num w:numId="1005">
+    <w:abstractNumId w:val="991"/>
+  </w:num>
+  <w:num w:numId="1006">
     <w:abstractNumId w:val="99411"/>
     <w:lvlOverride w:ilvl="0">
       <w:startOverride w:val="1"/>
@@ -3348,7 +5098,7 @@
       <w:startOverride w:val="1"/>
     </w:lvlOverride>
   </w:num>
-  <w:num w:numId="1005">
+  <w:num w:numId="1007">
     <w:abstractNumId w:val="99411"/>
     <w:lvlOverride w:ilvl="0">
       <w:startOverride w:val="1"/>
@@ -3378,7 +5128,7 @@
       <w:startOverride w:val="1"/>
     </w:lvlOverride>
   </w:num>
-  <w:num w:numId="1006">
+  <w:num w:numId="1008">
     <w:abstractNumId w:val="991"/>
   </w:num>
 </w:numbering>

</xml_diff>